<commit_message>
docs(es): regenerate user guide + architecture summary for v0.5.0
The Spanish Word/PDF docs described the old v0.3.x direct-from-browser
architecture (browser API key, CryptoJS, optional proxy). Regenerate both for
the current proxy-only v0.5.0 state: no API key in the browser, mandatory
hardened proxy that holds the key and validates the Qlik session (same-site
cookie), log-verbosity levels, local models via Ollama, streaming, and the
updated module list (log.js/config-validate.js in, security.js out).

Add scripts/build-docs-es.py: a single content model rendered to both .docx
(python-docx) and .pdf (reportlab) so the two formats can't diverge.
</commit_message>
<xml_diff>
--- a/Guia-de-Usuario-Asistente-IA-Anthropic-ES.docx
+++ b/Guia-de-Usuario-Asistente-IA-Anthropic-ES.docx
@@ -2,50 +2,11 @@
 <file path=word/document.xml><?xml version="1.0" encoding="utf-8"?>
 <w:document xmlns:wpc="http://schemas.microsoft.com/office/word/2010/wordprocessingCanvas" xmlns:mo="http://schemas.microsoft.com/office/mac/office/2008/main" xmlns:mc="http://schemas.openxmlformats.org/markup-compatibility/2006" xmlns:mv="urn:schemas-microsoft-com:mac:vml" xmlns:o="urn:schemas-microsoft-com:office:office" xmlns:r="http://schemas.openxmlformats.org/officeDocument/2006/relationships" xmlns:m="http://schemas.openxmlformats.org/officeDocument/2006/math" xmlns:v="urn:schemas-microsoft-com:vml" xmlns:wp14="http://schemas.microsoft.com/office/word/2010/wordprocessingDrawing" xmlns:wp="http://schemas.openxmlformats.org/drawingml/2006/wordprocessingDrawing" xmlns:w10="urn:schemas-microsoft-com:office:word" xmlns:w="http://schemas.openxmlformats.org/wordprocessingml/2006/main" xmlns:w14="http://schemas.microsoft.com/office/word/2010/wordml" xmlns:wpg="http://schemas.microsoft.com/office/word/2010/wordprocessingGroup" xmlns:wpi="http://schemas.microsoft.com/office/word/2010/wordprocessingInk" xmlns:wne="http://schemas.microsoft.com/office/word/2006/wordml" xmlns:wps="http://schemas.microsoft.com/office/word/2010/wordprocessingShape" mc:Ignorable="w14 wp14">
   <w:body>
-    <w:tbl>
-      <w:tblPr>
-        <w:tblW w:type="auto" w:w="0"/>
-        <w:tblLook w:firstColumn="1" w:firstRow="1" w:lastColumn="0" w:lastRow="0" w:noHBand="0" w:noVBand="1" w:val="04A0"/>
-      </w:tblPr>
-      <w:tblGrid>
-        <w:gridCol w:w="9972"/>
-      </w:tblGrid>
-      <w:tr>
-        <w:tc>
-          <w:tcPr>
-            <w:tcW w:type="dxa" w:w="9972"/>
-            <w:shd w:val="clear" w:color="auto" w:fill="009845"/>
-          </w:tcPr>
-          <w:p>
-            <w:r>
-              <w:rPr>
-                <w:rFonts w:ascii="Calibri" w:hAnsi="Calibri"/>
-                <w:b/>
-                <w:i w:val="0"/>
-                <w:color w:val="FFFFFF"/>
-                <w:sz w:val="21"/>
-              </w:rPr>
-              <w:t>GUÍA DEL USUARIO</w:t>
-            </w:r>
-          </w:p>
-        </w:tc>
-      </w:tr>
-    </w:tbl>
     <w:p>
-      <w:pPr>
-        <w:spacing w:after="120"/>
-      </w:pPr>
-    </w:p>
-    <w:p>
-      <w:pPr>
-        <w:spacing w:after="60"/>
-      </w:pPr>
       <w:r>
         <w:rPr>
-          <w:rFonts w:ascii="Calibri" w:hAnsi="Calibri"/>
           <w:b/>
-          <w:i w:val="0"/>
-          <w:color w:val="333333"/>
+          <w:color w:val="2E3440"/>
           <w:sz w:val="52"/>
         </w:rPr>
         <w:t>Guía del usuario</w:t>
@@ -53,43 +14,43 @@
     </w:p>
     <w:p>
       <w:pPr>
-        <w:spacing w:after="160"/>
         <w:pBdr>
-          <w:bottom w:val="single" w:sz="12" w:space="4" w:color="D7DCD9"/>
+          <w:bottom w:val="single" w:sz="24" w:space="1" w:color="C15F3C"/>
         </w:pBdr>
       </w:pPr>
+    </w:p>
+    <w:p>
       <w:r>
         <w:rPr>
-          <w:rFonts w:ascii="Calibri" w:hAnsi="Calibri"/>
-          <w:b w:val="0"/>
-          <w:i w:val="0"/>
-          <w:color w:val="595959"/>
-          <w:sz w:val="26"/>
+          <w:i/>
+          <w:color w:val="555555"/>
+          <w:sz w:val="24"/>
         </w:rPr>
         <w:t>Análisis de sus gráficos de Qlik Sense con IA, impulsado por Claude de Anthropic</w:t>
       </w:r>
     </w:p>
     <w:tbl>
       <w:tblPr>
+        <w:tblStyle w:val="TableGrid"/>
         <w:tblW w:type="auto" w:w="0"/>
+        <w:jc w:val="left"/>
         <w:tblLook w:firstColumn="1" w:firstRow="1" w:lastColumn="0" w:lastRow="0" w:noHBand="0" w:noVBand="1" w:val="04A0"/>
       </w:tblPr>
       <w:tblGrid>
-        <w:gridCol w:w="4986"/>
-        <w:gridCol w:w="4986"/>
+        <w:gridCol w:w="2304"/>
+        <w:gridCol w:w="6624"/>
       </w:tblGrid>
       <w:tr>
         <w:tc>
           <w:tcPr>
-            <w:tcW w:type="dxa" w:w="2268"/>
+            <w:tcW w:type="dxa" w:w="4824"/>
+            <w:shd w:val="clear" w:fill="ECECEC"/>
           </w:tcPr>
           <w:p>
+            <w:r/>
             <w:r>
               <w:rPr>
-                <w:rFonts w:ascii="Calibri" w:hAnsi="Calibri"/>
                 <w:b/>
-                <w:i w:val="0"/>
-                <w:color w:val="333333"/>
                 <w:sz w:val="20"/>
               </w:rPr>
               <w:t>Producto</w:t>
@@ -98,18 +59,16 @@
         </w:tc>
         <w:tc>
           <w:tcPr>
-            <w:tcW w:type="dxa" w:w="7370"/>
+            <w:tcW w:type="dxa" w:w="4824"/>
           </w:tcPr>
           <w:p>
+            <w:r/>
             <w:r>
               <w:rPr>
-                <w:rFonts w:ascii="Calibri" w:hAnsi="Calibri"/>
                 <w:b w:val="0"/>
-                <w:i w:val="0"/>
-                <w:color w:val="333333"/>
                 <w:sz w:val="20"/>
               </w:rPr>
-              <w:t>Anthropic AI Assistant para Qlik Sense</w:t>
+              <w:t>Anthropic AI Assistant para Qlik Sense Enterprise on Windows</w:t>
             </w:r>
           </w:p>
         </w:tc>
@@ -117,15 +76,14 @@
       <w:tr>
         <w:tc>
           <w:tcPr>
-            <w:tcW w:type="dxa" w:w="2268"/>
+            <w:tcW w:type="dxa" w:w="4824"/>
+            <w:shd w:val="clear" w:fill="ECECEC"/>
           </w:tcPr>
           <w:p>
+            <w:r/>
             <w:r>
               <w:rPr>
-                <w:rFonts w:ascii="Calibri" w:hAnsi="Calibri"/>
                 <w:b/>
-                <w:i w:val="0"/>
-                <w:color w:val="333333"/>
                 <w:sz w:val="20"/>
               </w:rPr>
               <w:t>Versión</w:t>
@@ -134,18 +92,16 @@
         </w:tc>
         <w:tc>
           <w:tcPr>
-            <w:tcW w:type="dxa" w:w="7370"/>
+            <w:tcW w:type="dxa" w:w="4824"/>
           </w:tcPr>
           <w:p>
+            <w:r/>
             <w:r>
               <w:rPr>
-                <w:rFonts w:ascii="Calibri" w:hAnsi="Calibri"/>
                 <w:b w:val="0"/>
-                <w:i w:val="0"/>
-                <w:color w:val="333333"/>
                 <w:sz w:val="20"/>
               </w:rPr>
-              <w:t>v0.3.3 · compilación 24</w:t>
+              <w:t>v0.5.0 · compilación 34</w:t>
             </w:r>
           </w:p>
         </w:tc>
@@ -153,15 +109,14 @@
       <w:tr>
         <w:tc>
           <w:tcPr>
-            <w:tcW w:type="dxa" w:w="2268"/>
+            <w:tcW w:type="dxa" w:w="4824"/>
+            <w:shd w:val="clear" w:fill="ECECEC"/>
           </w:tcPr>
           <w:p>
+            <w:r/>
             <w:r>
               <w:rPr>
-                <w:rFonts w:ascii="Calibri" w:hAnsi="Calibri"/>
                 <w:b/>
-                <w:i w:val="0"/>
-                <w:color w:val="333333"/>
                 <w:sz w:val="20"/>
               </w:rPr>
               <w:t>Autor</w:t>
@@ -170,18 +125,16 @@
         </w:tc>
         <w:tc>
           <w:tcPr>
-            <w:tcW w:type="dxa" w:w="7370"/>
+            <w:tcW w:type="dxa" w:w="4824"/>
           </w:tcPr>
           <w:p>
+            <w:r/>
             <w:r>
               <w:rPr>
-                <w:rFonts w:ascii="Calibri" w:hAnsi="Calibri"/>
                 <w:b w:val="0"/>
-                <w:i w:val="0"/>
-                <w:color w:val="333333"/>
                 <w:sz w:val="20"/>
               </w:rPr>
-              <w:t>mabaeyens</w:t>
+              <w:t>Miguel Angel Baeyens</w:t>
             </w:r>
           </w:p>
         </w:tc>
@@ -189,15 +142,14 @@
       <w:tr>
         <w:tc>
           <w:tcPr>
-            <w:tcW w:type="dxa" w:w="2268"/>
+            <w:tcW w:type="dxa" w:w="4824"/>
+            <w:shd w:val="clear" w:fill="ECECEC"/>
           </w:tcPr>
           <w:p>
+            <w:r/>
             <w:r>
               <w:rPr>
-                <w:rFonts w:ascii="Calibri" w:hAnsi="Calibri"/>
                 <w:b/>
-                <w:i w:val="0"/>
-                <w:color w:val="333333"/>
                 <w:sz w:val="20"/>
               </w:rPr>
               <w:t>Fecha</w:t>
@@ -206,18 +158,16 @@
         </w:tc>
         <w:tc>
           <w:tcPr>
-            <w:tcW w:type="dxa" w:w="7370"/>
+            <w:tcW w:type="dxa" w:w="4824"/>
           </w:tcPr>
           <w:p>
+            <w:r/>
             <w:r>
               <w:rPr>
-                <w:rFonts w:ascii="Calibri" w:hAnsi="Calibri"/>
                 <w:b w:val="0"/>
-                <w:i w:val="0"/>
-                <w:color w:val="333333"/>
                 <w:sz w:val="20"/>
               </w:rPr>
-              <w:t>19 de junio de 2026</w:t>
+              <w:t>25 de julio de 2026</w:t>
             </w:r>
           </w:p>
         </w:tc>
@@ -225,15 +175,14 @@
       <w:tr>
         <w:tc>
           <w:tcPr>
-            <w:tcW w:type="dxa" w:w="2268"/>
+            <w:tcW w:type="dxa" w:w="4824"/>
+            <w:shd w:val="clear" w:fill="ECECEC"/>
           </w:tcPr>
           <w:p>
+            <w:r/>
             <w:r>
               <w:rPr>
-                <w:rFonts w:ascii="Calibri" w:hAnsi="Calibri"/>
                 <w:b/>
-                <w:i w:val="0"/>
-                <w:color w:val="333333"/>
                 <w:sz w:val="20"/>
               </w:rPr>
               <w:t>Idioma</w:t>
@@ -242,15 +191,13 @@
         </w:tc>
         <w:tc>
           <w:tcPr>
-            <w:tcW w:type="dxa" w:w="7370"/>
+            <w:tcW w:type="dxa" w:w="4824"/>
           </w:tcPr>
           <w:p>
+            <w:r/>
             <w:r>
               <w:rPr>
-                <w:rFonts w:ascii="Calibri" w:hAnsi="Calibri"/>
                 <w:b w:val="0"/>
-                <w:i w:val="0"/>
-                <w:color w:val="333333"/>
                 <w:sz w:val="20"/>
               </w:rPr>
               <w:t>Español</w:t>
@@ -259,10 +206,209 @@
         </w:tc>
       </w:tr>
     </w:tbl>
+    <w:p/>
+    <w:tbl>
+      <w:tblPr>
+        <w:tblStyle w:val="TableGrid"/>
+        <w:tblW w:type="auto" w:w="0"/>
+        <w:tblLook w:firstColumn="1" w:firstRow="1" w:lastColumn="0" w:lastRow="0" w:noHBand="0" w:noVBand="1" w:val="04A0"/>
+      </w:tblPr>
+      <w:tblGrid>
+        <w:gridCol w:w="9648"/>
+      </w:tblGrid>
+      <w:tr>
+        <w:tc>
+          <w:tcPr>
+            <w:tcW w:type="dxa" w:w="9648"/>
+            <w:shd w:val="clear" w:fill="FFF4E5"/>
+          </w:tcPr>
+          <w:p>
+            <w:r/>
+            <w:r>
+              <w:rPr>
+                <w:b/>
+                <w:color w:val="C15F3C"/>
+              </w:rPr>
+              <w:t>Aviso — demostración experimental</w:t>
+            </w:r>
+          </w:p>
+          <w:p>
+            <w:r>
+              <w:rPr>
+                <w:sz w:val="19"/>
+              </w:rPr>
+              <w:t>Esta extensión es un desarrollo de demostración y no un producto oficialmente soportado por Qlik. Ni Qlik ni el autor asumen responsabilidad alguna por cualquier incidencia.</w:t>
+            </w:r>
+          </w:p>
+          <w:p>
+            <w:r>
+              <w:rPr>
+                <w:sz w:val="19"/>
+              </w:rPr>
+              <w:t>Al hacer una pregunta, los datos del gráfico seleccionado salen del entorno hacia un LLM (Anthropic, a través del proxy) — salvo que use un modelo local, en cuyo caso los datos permanecen en su infraestructura. No lo utilice con datos sensibles, regulados o personales sin autorización expresa.</w:t>
+            </w:r>
+          </w:p>
+        </w:tc>
+      </w:tr>
+    </w:tbl>
+    <w:p/>
+    <w:p>
+      <w:r>
+        <w:rPr>
+          <w:b/>
+          <w:color w:val="C15F3C"/>
+          <w:sz w:val="30"/>
+        </w:rPr>
+        <w:t>1. Introducción: ¿qué es?</w:t>
+      </w:r>
+    </w:p>
+    <w:p>
+      <w:r>
+        <w:t>El Anthropic AI Assistant es una extensión de visualización para Qlik Sense que añade un panel de asistente de IA a sus cuadros de mando. El flujo es sencillo: seleccione hasta 5 gráficos, escriba una pregunta en lenguaje natural y reciba un análisis generado por Claude.</w:t>
+      </w:r>
+    </w:p>
     <w:p>
       <w:pPr>
-        <w:spacing w:after="160"/>
+        <w:pStyle w:val="ListBullet"/>
       </w:pPr>
+      <w:r>
+        <w:t>En la primera pregunta, la extensión también envía la estructura del modelo de datos (nombres de tablas, campos e ítems maestros) para que Claude interprete el gráfico en contexto.</w:t>
+      </w:r>
+    </w:p>
+    <w:p>
+      <w:pPr>
+        <w:pStyle w:val="ListBullet"/>
+      </w:pPr>
+      <w:r>
+        <w:t>Funciona sobre Qlik Sense Enterprise on Windows (Client-Managed). Qlik Sense Cloud queda fuera de alcance (Qlik Cloud dispone de asistentes de IA nativos como Qlik Answers).</w:t>
+      </w:r>
+    </w:p>
+    <w:p>
+      <w:pPr>
+        <w:pStyle w:val="ListBullet"/>
+      </w:pPr>
+      <w:r>
+        <w:t>Novedad v0.5.0: la extensión ya NO guarda ninguna clave de API en el navegador. Todo el tráfico pasa por un proxy endurecido, que guarda la clave en el servidor y autentica su sesión de Qlik. El proxy es obligatorio.</w:t>
+      </w:r>
+    </w:p>
+    <w:p>
+      <w:pPr>
+        <w:pStyle w:val="ListBullet"/>
+      </w:pPr>
+      <w:r>
+        <w:t>Puede elegir el modelo desde el propio panel (Haiku / Sonnet / Opus) e incluso un modelo local ejecutado con Ollama, en cuyo caso los datos no salen de su infraestructura.</w:t>
+      </w:r>
+    </w:p>
+    <w:p>
+      <w:r>
+        <w:rPr>
+          <w:b/>
+          <w:color w:val="C15F3C"/>
+          <w:sz w:val="30"/>
+        </w:rPr>
+        <w:t>2. Requisitos previos</w:t>
+      </w:r>
+    </w:p>
+    <w:p>
+      <w:pPr>
+        <w:pStyle w:val="ListBullet"/>
+      </w:pPr>
+      <w:r>
+        <w:t>Qlik Sense Enterprise on Windows versión ≥ 2025 o 2026 (versiones de 2024 pueden funcionar; en 2025 y 2026 se han introducido varios gráficos nuevos).</w:t>
+      </w:r>
+    </w:p>
+    <w:p>
+      <w:pPr>
+        <w:pStyle w:val="ListBullet"/>
+      </w:pPr>
+      <w:r>
+        <w:t>El proxy endurecido desplegado y accesible (ver la Guía de instalación / proxy/README.md). El proxy guarda la clave de API de Anthropic y valida la sesión de Qlik.</w:t>
+      </w:r>
+    </w:p>
+    <w:p>
+      <w:pPr>
+        <w:pStyle w:val="ListBullet"/>
+      </w:pPr>
+      <w:r>
+        <w:t>Que el navegador pueda alcanzar la URL del proxy por HTTPS con un certificado en el que confíe (idealmente emitido por su CA interna).</w:t>
+      </w:r>
+    </w:p>
+    <w:p>
+      <w:pPr>
+        <w:pStyle w:val="ListBullet"/>
+      </w:pPr>
+      <w:r>
+        <w:t>Para modelos locales: un servidor Ollama en marcha y la ruta /api/ollama del proxy configurada.</w:t>
+      </w:r>
+    </w:p>
+    <w:p>
+      <w:r>
+        <w:rPr>
+          <w:b/>
+          <w:color w:val="C15F3C"/>
+          <w:sz w:val="30"/>
+        </w:rPr>
+        <w:t>3. Instalación</w:t>
+      </w:r>
+    </w:p>
+    <w:p>
+      <w:r>
+        <w:rPr>
+          <w:b/>
+          <w:color w:val="2E3440"/>
+          <w:sz w:val="24"/>
+        </w:rPr>
+        <w:t>Qlik Sense Enterprise on Windows (QSEoW)</w:t>
+      </w:r>
+    </w:p>
+    <w:p>
+      <w:pPr>
+        <w:pStyle w:val="ListBullet"/>
+      </w:pPr>
+      <w:r>
+        <w:t>En la QMC → Extensiones → Importar, suba el archivo .zip. La extensión queda disponible de inmediato.</w:t>
+      </w:r>
+    </w:p>
+    <w:p>
+      <w:r>
+        <w:rPr>
+          <w:b/>
+          <w:color w:val="2E3440"/>
+          <w:sz w:val="24"/>
+        </w:rPr>
+        <w:t>Añadir el asistente a una hoja</w:t>
+      </w:r>
+    </w:p>
+    <w:p>
+      <w:pPr>
+        <w:pStyle w:val="ListBullet"/>
+      </w:pPr>
+      <w:r>
+        <w:t>Abra una app en modo edición, busque la visualización “Anthropic AI Assistant” y arrástrela a la hoja. Aparecerá un botón anclado en la parte inferior derecha, que se expandirá en un panel flotante.</w:t>
+      </w:r>
+    </w:p>
+    <w:p>
+      <w:pPr>
+        <w:pStyle w:val="ListBullet"/>
+      </w:pPr>
+      <w:r>
+        <w:t>El objeto solo debe añadirse una única vez y no es necesario especificar ningún título. En las propiedades del objeto se configura la URL del proxy.</w:t>
+      </w:r>
+    </w:p>
+    <w:p>
+      <w:r>
+        <w:rPr>
+          <w:b/>
+          <w:color w:val="C15F3C"/>
+          <w:sz w:val="30"/>
+        </w:rPr>
+        <w:t>4. Configuración inicial (panel de propiedades)</w:t>
+      </w:r>
+    </w:p>
+    <w:p>
+      <w:r>
+        <w:t>En el panel de propiedades del objeto, sección “Anthropic AI Settings”, configure:</w:t>
+      </w:r>
     </w:p>
     <w:tbl>
       <w:tblPr>
@@ -271,884 +417,22 @@
         <w:tblLook w:firstColumn="1" w:firstRow="1" w:lastColumn="0" w:lastRow="0" w:noHBand="0" w:noVBand="1" w:val="04A0"/>
       </w:tblPr>
       <w:tblGrid>
-        <w:gridCol w:w="9972"/>
+        <w:gridCol w:w="4824"/>
+        <w:gridCol w:w="4824"/>
       </w:tblGrid>
       <w:tr>
         <w:tc>
           <w:tcPr>
-            <w:tcW w:type="dxa" w:w="9972"/>
-            <w:shd w:val="clear" w:color="auto" w:fill="FFF8E6"/>
-            <w:tcBorders>
-              <w:top w:val="single" w:sz="6" w:space="4" w:color="E0A800"/>
-              <w:bottom w:val="single" w:sz="6" w:space="4" w:color="E0A800"/>
-              <w:left w:val="single" w:sz="6" w:space="4" w:color="E0A800"/>
-              <w:right w:val="single" w:sz="6" w:space="4" w:color="E0A800"/>
-            </w:tcBorders>
-            <w:tcBorders>
-              <w:left w:val="single" w:sz="24" w:space="4" w:color="E0A800"/>
-            </w:tcBorders>
+            <w:tcW w:type="dxa" w:w="4824"/>
+            <w:shd w:val="clear" w:fill="C15F3C"/>
           </w:tcPr>
           <w:p>
-            <w:pPr>
-              <w:spacing w:after="80"/>
-            </w:pPr>
+            <w:r/>
             <w:r>
               <w:rPr>
-                <w:rFonts w:ascii="Calibri" w:hAnsi="Calibri"/>
                 <w:b/>
-                <w:i w:val="0"/>
-                <w:color w:val="7A5C00"/>
+                <w:color w:val="FFFFFF"/>
                 <w:sz w:val="20"/>
-              </w:rPr>
-              <w:t>Aviso — demostración experimental</w:t>
-            </w:r>
-          </w:p>
-          <w:p>
-            <w:pPr>
-              <w:spacing w:after="60"/>
-            </w:pPr>
-            <w:r>
-              <w:rPr>
-                <w:rFonts w:ascii="Calibri" w:hAnsi="Calibri"/>
-                <w:b w:val="0"/>
-                <w:i w:val="0"/>
-                <w:color w:val="333333"/>
-              </w:rPr>
-              <w:t xml:space="preserve">Esta extensión es un activo de </w:t>
-            </w:r>
-            <w:r>
-              <w:rPr>
-                <w:rFonts w:ascii="Calibri" w:hAnsi="Calibri"/>
-                <w:b/>
-                <w:i w:val="0"/>
-                <w:color w:val="333333"/>
-              </w:rPr>
-              <w:t>demostración experimental (v0.3.3, compilación 24)</w:t>
-            </w:r>
-            <w:r>
-              <w:rPr>
-                <w:rFonts w:ascii="Calibri" w:hAnsi="Calibri"/>
-                <w:b w:val="0"/>
-                <w:i w:val="0"/>
-                <w:color w:val="333333"/>
-              </w:rPr>
-              <w:t xml:space="preserve">, no un producto. </w:t>
-            </w:r>
-            <w:r>
-              <w:rPr>
-                <w:rFonts w:ascii="Calibri" w:hAnsi="Calibri"/>
-                <w:b/>
-                <w:i w:val="0"/>
-                <w:color w:val="333333"/>
-              </w:rPr>
-              <w:t>No</w:t>
-            </w:r>
-            <w:r>
-              <w:rPr>
-                <w:rFonts w:ascii="Calibri" w:hAnsi="Calibri"/>
-                <w:b w:val="0"/>
-                <w:i w:val="0"/>
-                <w:color w:val="333333"/>
-              </w:rPr>
-              <w:t xml:space="preserve"> está reforzada para producción y </w:t>
-            </w:r>
-            <w:r>
-              <w:rPr>
-                <w:rFonts w:ascii="Calibri" w:hAnsi="Calibri"/>
-                <w:b/>
-                <w:i w:val="0"/>
-                <w:color w:val="333333"/>
-              </w:rPr>
-              <w:t>no</w:t>
-            </w:r>
-            <w:r>
-              <w:rPr>
-                <w:rFonts w:ascii="Calibri" w:hAnsi="Calibri"/>
-                <w:b w:val="0"/>
-                <w:i w:val="0"/>
-                <w:color w:val="333333"/>
-              </w:rPr>
-              <w:t xml:space="preserve"> es una oferta de Qlik ni una integración soportada.</w:t>
-            </w:r>
-          </w:p>
-          <w:p>
-            <w:pPr>
-              <w:spacing w:after="60"/>
-            </w:pPr>
-            <w:r>
-              <w:rPr>
-                <w:rFonts w:ascii="Calibri" w:hAnsi="Calibri"/>
-                <w:b/>
-                <w:i w:val="0"/>
-                <w:color w:val="333333"/>
-              </w:rPr>
-              <w:t>Ni Qlik ni el autor asumen responsabilidad alguna</w:t>
-            </w:r>
-            <w:r>
-              <w:rPr>
-                <w:rFonts w:ascii="Calibri" w:hAnsi="Calibri"/>
-                <w:b w:val="0"/>
-                <w:i w:val="0"/>
-                <w:color w:val="333333"/>
-              </w:rPr>
-              <w:t xml:space="preserve"> por cualquier incidencia, exposición de datos, coste o daño derivado de su uso en cualquier entorno de cliente o producción. Úselo bajo su propia responsabilidad.</w:t>
-            </w:r>
-          </w:p>
-          <w:p>
-            <w:pPr>
-              <w:spacing w:after="60"/>
-            </w:pPr>
-            <w:r>
-              <w:rPr>
-                <w:rFonts w:ascii="Calibri" w:hAnsi="Calibri"/>
-                <w:b w:val="0"/>
-                <w:i w:val="0"/>
-                <w:color w:val="333333"/>
-              </w:rPr>
-              <w:t>Al hacer una pregunta, los datos del gráfico seleccionado salen del entorno hacia un LLM externo (Anthropic). No lo utilice con datos sensibles, regulados o personales sin autorización expresa.</w:t>
-            </w:r>
-          </w:p>
-        </w:tc>
-      </w:tr>
-    </w:tbl>
-    <w:p>
-      <w:r>
-        <w:br w:type="page"/>
-      </w:r>
-    </w:p>
-    <w:p>
-      <w:pPr>
-        <w:spacing w:before="280" w:after="120"/>
-        <w:pBdr>
-          <w:bottom w:val="single" w:sz="12" w:space="4" w:color="D7DCD9"/>
-        </w:pBdr>
-      </w:pPr>
-      <w:r>
-        <w:rPr>
-          <w:rFonts w:ascii="Calibri" w:hAnsi="Calibri"/>
-          <w:b/>
-          <w:i w:val="0"/>
-          <w:color w:val="007A38"/>
-          <w:sz w:val="32"/>
-        </w:rPr>
-        <w:t>1. Introducción: ¿qué es?</w:t>
-      </w:r>
-    </w:p>
-    <w:p>
-      <w:pPr>
-        <w:spacing w:after="140"/>
-      </w:pPr>
-      <w:r>
-        <w:rPr>
-          <w:rFonts w:ascii="Calibri" w:hAnsi="Calibri"/>
-          <w:b w:val="0"/>
-          <w:i w:val="0"/>
-          <w:color w:val="595959"/>
-          <w:sz w:val="22"/>
-        </w:rPr>
-        <w:t>El Anthropic AI Assistant es una extensión de visualización para Qlik Sense que añade un panel de asistente de IA a sus cuadros de mando. El flujo es sencillo: seleccione un gráfico, escriba una pregunta en lenguaje natural y reciba un análisis generado por Claude.</w:t>
-      </w:r>
-    </w:p>
-    <w:p>
-      <w:pPr>
-        <w:spacing w:after="40"/>
-        <w:ind w:left="340"/>
-      </w:pPr>
-      <w:r>
-        <w:rPr>
-          <w:rFonts w:ascii="Calibri" w:hAnsi="Calibri"/>
-          <w:b/>
-          <w:i w:val="0"/>
-          <w:color w:val="009845"/>
-          <w:sz w:val="21"/>
-        </w:rPr>
-        <w:t xml:space="preserve">▪  </w:t>
-      </w:r>
-      <w:r>
-        <w:rPr>
-          <w:rFonts w:ascii="Calibri" w:hAnsi="Calibri"/>
-          <w:b w:val="0"/>
-          <w:i w:val="0"/>
-          <w:color w:val="333333"/>
-          <w:sz w:val="21"/>
-        </w:rPr>
-        <w:t>En la primera pregunta, la extensión también envía la estructura del modelo de datos (nombres de campos e ítems maestros) para que Claude interprete el gráfico en contexto.</w:t>
-      </w:r>
-    </w:p>
-    <w:p>
-      <w:pPr>
-        <w:spacing w:after="40"/>
-        <w:ind w:left="340"/>
-      </w:pPr>
-      <w:r>
-        <w:rPr>
-          <w:rFonts w:ascii="Calibri" w:hAnsi="Calibri"/>
-          <w:b/>
-          <w:i w:val="0"/>
-          <w:color w:val="009845"/>
-          <w:sz w:val="21"/>
-        </w:rPr>
-        <w:t xml:space="preserve">▪  </w:t>
-      </w:r>
-      <w:r>
-        <w:rPr>
-          <w:rFonts w:ascii="Calibri" w:hAnsi="Calibri"/>
-          <w:b w:val="0"/>
-          <w:i w:val="0"/>
-          <w:color w:val="333333"/>
-          <w:sz w:val="21"/>
-        </w:rPr>
-        <w:t xml:space="preserve">Funciona sobre </w:t>
-      </w:r>
-      <w:r>
-        <w:rPr>
-          <w:rFonts w:ascii="Calibri" w:hAnsi="Calibri"/>
-          <w:b/>
-          <w:i w:val="0"/>
-          <w:color w:val="333333"/>
-          <w:sz w:val="21"/>
-        </w:rPr>
-        <w:t>Qlik Sense client-managed en Windows</w:t>
-      </w:r>
-      <w:r>
-        <w:rPr>
-          <w:rFonts w:ascii="Calibri" w:hAnsi="Calibri"/>
-          <w:b w:val="0"/>
-          <w:i w:val="0"/>
-          <w:color w:val="333333"/>
-          <w:sz w:val="21"/>
-        </w:rPr>
-        <w:t xml:space="preserve"> (Desktop y Enterprise/QSEoW). </w:t>
-      </w:r>
-      <w:r>
-        <w:rPr>
-          <w:rFonts w:ascii="Calibri" w:hAnsi="Calibri"/>
-          <w:b/>
-          <w:i w:val="0"/>
-          <w:color w:val="333333"/>
-          <w:sz w:val="21"/>
-        </w:rPr>
-        <w:t>Qlik Sense Cloud queda fuera de alcance</w:t>
-      </w:r>
-      <w:r>
-        <w:rPr>
-          <w:rFonts w:ascii="Calibri" w:hAnsi="Calibri"/>
-          <w:b w:val="0"/>
-          <w:i w:val="0"/>
-          <w:color w:val="333333"/>
-          <w:sz w:val="21"/>
-        </w:rPr>
-        <w:t xml:space="preserve"> (Cloud dispone de asistentes de IA nativos).</w:t>
-      </w:r>
-    </w:p>
-    <w:p>
-      <w:pPr>
-        <w:spacing w:after="40"/>
-        <w:ind w:left="340"/>
-      </w:pPr>
-      <w:r>
-        <w:rPr>
-          <w:rFonts w:ascii="Calibri" w:hAnsi="Calibri"/>
-          <w:b/>
-          <w:i w:val="0"/>
-          <w:color w:val="009845"/>
-          <w:sz w:val="21"/>
-        </w:rPr>
-        <w:t xml:space="preserve">▪  </w:t>
-      </w:r>
-      <w:r>
-        <w:rPr>
-          <w:rFonts w:ascii="Calibri" w:hAnsi="Calibri"/>
-          <w:b w:val="0"/>
-          <w:i w:val="0"/>
-          <w:color w:val="333333"/>
-          <w:sz w:val="21"/>
-        </w:rPr>
-        <w:t xml:space="preserve">Llama a la API de Anthropic </w:t>
-      </w:r>
-      <w:r>
-        <w:rPr>
-          <w:rFonts w:ascii="Calibri" w:hAnsi="Calibri"/>
-          <w:b/>
-          <w:i w:val="0"/>
-          <w:color w:val="333333"/>
-          <w:sz w:val="21"/>
-        </w:rPr>
-        <w:t>directamente desde el navegador</w:t>
-      </w:r>
-      <w:r>
-        <w:rPr>
-          <w:rFonts w:ascii="Calibri" w:hAnsi="Calibri"/>
-          <w:b w:val="0"/>
-          <w:i w:val="0"/>
-          <w:color w:val="333333"/>
-          <w:sz w:val="21"/>
-        </w:rPr>
-        <w:t>; un proxy local es opcional, no obligatorio.</w:t>
-      </w:r>
-    </w:p>
-    <w:p>
-      <w:pPr>
-        <w:spacing w:before="280" w:after="120"/>
-        <w:pBdr>
-          <w:bottom w:val="single" w:sz="12" w:space="4" w:color="D7DCD9"/>
-        </w:pBdr>
-      </w:pPr>
-      <w:r>
-        <w:rPr>
-          <w:rFonts w:ascii="Calibri" w:hAnsi="Calibri"/>
-          <w:b/>
-          <w:i w:val="0"/>
-          <w:color w:val="007A38"/>
-          <w:sz w:val="32"/>
-        </w:rPr>
-        <w:t>2. Requisitos previos</w:t>
-      </w:r>
-    </w:p>
-    <w:p>
-      <w:pPr>
-        <w:spacing w:after="40"/>
-        <w:ind w:left="340"/>
-      </w:pPr>
-      <w:r>
-        <w:rPr>
-          <w:rFonts w:ascii="Calibri" w:hAnsi="Calibri"/>
-          <w:b/>
-          <w:i w:val="0"/>
-          <w:color w:val="009845"/>
-          <w:sz w:val="21"/>
-        </w:rPr>
-        <w:t xml:space="preserve">▪  </w:t>
-      </w:r>
-      <w:r>
-        <w:rPr>
-          <w:rFonts w:ascii="Calibri" w:hAnsi="Calibri"/>
-          <w:b w:val="0"/>
-          <w:i w:val="0"/>
-          <w:color w:val="333333"/>
-          <w:sz w:val="21"/>
-        </w:rPr>
-        <w:t xml:space="preserve">Qlik Sense client-managed en Windows, versión </w:t>
-      </w:r>
-      <w:r>
-        <w:rPr>
-          <w:rFonts w:ascii="Calibri" w:hAnsi="Calibri"/>
-          <w:b/>
-          <w:i w:val="0"/>
-          <w:color w:val="333333"/>
-          <w:sz w:val="21"/>
-        </w:rPr>
-        <w:t>≥ 3.0.x</w:t>
-      </w:r>
-      <w:r>
-        <w:rPr>
-          <w:rFonts w:ascii="Calibri" w:hAnsi="Calibri"/>
-          <w:b w:val="0"/>
-          <w:i w:val="0"/>
-          <w:color w:val="333333"/>
-          <w:sz w:val="21"/>
-        </w:rPr>
-        <w:t xml:space="preserve"> (Desktop o QSEoW).</w:t>
-      </w:r>
-    </w:p>
-    <w:p>
-      <w:pPr>
-        <w:spacing w:after="40"/>
-        <w:ind w:left="340"/>
-      </w:pPr>
-      <w:r>
-        <w:rPr>
-          <w:rFonts w:ascii="Calibri" w:hAnsi="Calibri"/>
-          <w:b/>
-          <w:i w:val="0"/>
-          <w:color w:val="009845"/>
-          <w:sz w:val="21"/>
-        </w:rPr>
-        <w:t xml:space="preserve">▪  </w:t>
-      </w:r>
-      <w:r>
-        <w:rPr>
-          <w:rFonts w:ascii="Calibri" w:hAnsi="Calibri"/>
-          <w:b w:val="0"/>
-          <w:i w:val="0"/>
-          <w:color w:val="333333"/>
-          <w:sz w:val="21"/>
-        </w:rPr>
-        <w:t xml:space="preserve">Una </w:t>
-      </w:r>
-      <w:r>
-        <w:rPr>
-          <w:rFonts w:ascii="Calibri" w:hAnsi="Calibri"/>
-          <w:b/>
-          <w:i w:val="0"/>
-          <w:color w:val="333333"/>
-          <w:sz w:val="21"/>
-        </w:rPr>
-        <w:t>clave de API de Anthropic</w:t>
-      </w:r>
-      <w:r>
-        <w:rPr>
-          <w:rFonts w:ascii="Calibri" w:hAnsi="Calibri"/>
-          <w:b w:val="0"/>
-          <w:i w:val="0"/>
-          <w:color w:val="333333"/>
-          <w:sz w:val="21"/>
-        </w:rPr>
-        <w:t>, que se obtiene en https://console.anthropic.com/api_keys.</w:t>
-      </w:r>
-    </w:p>
-    <w:p>
-      <w:pPr>
-        <w:spacing w:after="40"/>
-        <w:ind w:left="340"/>
-      </w:pPr>
-      <w:r>
-        <w:rPr>
-          <w:rFonts w:ascii="Calibri" w:hAnsi="Calibri"/>
-          <w:b/>
-          <w:i w:val="0"/>
-          <w:color w:val="009845"/>
-          <w:sz w:val="21"/>
-        </w:rPr>
-        <w:t xml:space="preserve">▪  </w:t>
-      </w:r>
-      <w:r>
-        <w:rPr>
-          <w:rFonts w:ascii="Calibri" w:hAnsi="Calibri"/>
-          <w:b w:val="0"/>
-          <w:i w:val="0"/>
-          <w:color w:val="333333"/>
-          <w:sz w:val="21"/>
-        </w:rPr>
-        <w:t xml:space="preserve">Que el navegador pueda alcanzar </w:t>
-      </w:r>
-      <w:r>
-        <w:rPr>
-          <w:rFonts w:ascii="Calibri" w:hAnsi="Calibri"/>
-          <w:b/>
-          <w:i w:val="0"/>
-          <w:color w:val="333333"/>
-          <w:sz w:val="21"/>
-        </w:rPr>
-        <w:t>api.anthropic.com</w:t>
-      </w:r>
-      <w:r>
-        <w:rPr>
-          <w:rFonts w:ascii="Calibri" w:hAnsi="Calibri"/>
-          <w:b w:val="0"/>
-          <w:i w:val="0"/>
-          <w:color w:val="333333"/>
-          <w:sz w:val="21"/>
-        </w:rPr>
-        <w:t xml:space="preserve">. Si la red corporativa bloquea esa salida, configure una </w:t>
-      </w:r>
-      <w:r>
-        <w:rPr>
-          <w:rFonts w:ascii="Calibri" w:hAnsi="Calibri"/>
-          <w:b/>
-          <w:i w:val="0"/>
-          <w:color w:val="333333"/>
-          <w:sz w:val="21"/>
-        </w:rPr>
-        <w:t>URL de proxy</w:t>
-      </w:r>
-      <w:r>
-        <w:rPr>
-          <w:rFonts w:ascii="Calibri" w:hAnsi="Calibri"/>
-          <w:b w:val="0"/>
-          <w:i w:val="0"/>
-          <w:color w:val="333333"/>
-          <w:sz w:val="21"/>
-        </w:rPr>
-        <w:t xml:space="preserve"> (ver sección 5).</w:t>
-      </w:r>
-    </w:p>
-    <w:p>
-      <w:pPr>
-        <w:spacing w:before="280" w:after="120"/>
-        <w:pBdr>
-          <w:bottom w:val="single" w:sz="12" w:space="4" w:color="D7DCD9"/>
-        </w:pBdr>
-      </w:pPr>
-      <w:r>
-        <w:rPr>
-          <w:rFonts w:ascii="Calibri" w:hAnsi="Calibri"/>
-          <w:b/>
-          <w:i w:val="0"/>
-          <w:color w:val="007A38"/>
-          <w:sz w:val="32"/>
-        </w:rPr>
-        <w:t>3. Instalación</w:t>
-      </w:r>
-    </w:p>
-    <w:p>
-      <w:pPr>
-        <w:spacing w:before="140" w:after="40"/>
-      </w:pPr>
-      <w:r>
-        <w:rPr>
-          <w:rFonts w:ascii="Calibri" w:hAnsi="Calibri"/>
-          <w:b/>
-          <w:i w:val="0"/>
-          <w:color w:val="595959"/>
-          <w:sz w:val="21"/>
-        </w:rPr>
-        <w:t>Qlik Sense Desktop (Windows)</w:t>
-      </w:r>
-    </w:p>
-    <w:p>
-      <w:pPr>
-        <w:spacing w:after="40"/>
-        <w:ind w:left="340"/>
-      </w:pPr>
-      <w:r>
-        <w:rPr>
-          <w:rFonts w:ascii="Calibri" w:hAnsi="Calibri"/>
-          <w:b/>
-          <w:i w:val="0"/>
-          <w:color w:val="009845"/>
-          <w:sz w:val="21"/>
-        </w:rPr>
-        <w:t xml:space="preserve">▪  </w:t>
-      </w:r>
-      <w:r>
-        <w:rPr>
-          <w:rFonts w:ascii="Calibri" w:hAnsi="Calibri"/>
-          <w:b w:val="0"/>
-          <w:i w:val="0"/>
-          <w:color w:val="333333"/>
-          <w:sz w:val="21"/>
-        </w:rPr>
-        <w:t xml:space="preserve">Descomprima el paquete </w:t>
-      </w:r>
-      <w:r>
-        <w:rPr>
-          <w:rFonts w:ascii="Consolas" w:hAnsi="Consolas"/>
-          <w:b w:val="0"/>
-          <w:i w:val="0"/>
-          <w:color w:val="333333"/>
-          <w:sz w:val="21"/>
-        </w:rPr>
-        <w:t>AnthropicExtension-v0.3.3.zip</w:t>
-      </w:r>
-      <w:r>
-        <w:rPr>
-          <w:rFonts w:ascii="Calibri" w:hAnsi="Calibri"/>
-          <w:b w:val="0"/>
-          <w:i w:val="0"/>
-          <w:color w:val="333333"/>
-          <w:sz w:val="21"/>
-        </w:rPr>
-        <w:t xml:space="preserve"> en:</w:t>
-      </w:r>
-    </w:p>
-    <w:p>
-      <w:pPr>
-        <w:spacing w:before="60" w:after="140"/>
-        <w:ind w:left="170"/>
-        <w:shd w:val="clear" w:color="auto" w:fill="F2F4F3"/>
-      </w:pPr>
-      <w:r>
-        <w:rPr>
-          <w:rFonts w:ascii="Consolas" w:hAnsi="Consolas"/>
-          <w:b w:val="0"/>
-          <w:i w:val="0"/>
-          <w:color w:val="333333"/>
-          <w:sz w:val="18"/>
-        </w:rPr>
-        <w:t>%USERPROFILE%\Documents\Qlik\Sense\Extensions\AnthropicExtension\</w:t>
-      </w:r>
-    </w:p>
-    <w:p>
-      <w:pPr>
-        <w:spacing w:after="40"/>
-        <w:ind w:left="340"/>
-      </w:pPr>
-      <w:r>
-        <w:rPr>
-          <w:rFonts w:ascii="Calibri" w:hAnsi="Calibri"/>
-          <w:b/>
-          <w:i w:val="0"/>
-          <w:color w:val="009845"/>
-          <w:sz w:val="21"/>
-        </w:rPr>
-        <w:t xml:space="preserve">▪  </w:t>
-      </w:r>
-      <w:r>
-        <w:rPr>
-          <w:rFonts w:ascii="Calibri" w:hAnsi="Calibri"/>
-          <w:b w:val="0"/>
-          <w:i w:val="0"/>
-          <w:color w:val="333333"/>
-          <w:sz w:val="21"/>
-        </w:rPr>
-        <w:t xml:space="preserve">Asegúrese de que </w:t>
-      </w:r>
-      <w:r>
-        <w:rPr>
-          <w:rFonts w:ascii="Consolas" w:hAnsi="Consolas"/>
-          <w:b w:val="0"/>
-          <w:i w:val="0"/>
-          <w:color w:val="333333"/>
-          <w:sz w:val="21"/>
-        </w:rPr>
-        <w:t>AnthropicExtension.qext</w:t>
-      </w:r>
-      <w:r>
-        <w:rPr>
-          <w:rFonts w:ascii="Calibri" w:hAnsi="Calibri"/>
-          <w:b w:val="0"/>
-          <w:i w:val="0"/>
-          <w:color w:val="333333"/>
-          <w:sz w:val="21"/>
-        </w:rPr>
-        <w:t xml:space="preserve"> queda en la raíz de esa carpeta y reinicie Qlik Sense Desktop.</w:t>
-      </w:r>
-    </w:p>
-    <w:p>
-      <w:pPr>
-        <w:spacing w:before="140" w:after="40"/>
-      </w:pPr>
-      <w:r>
-        <w:rPr>
-          <w:rFonts w:ascii="Calibri" w:hAnsi="Calibri"/>
-          <w:b/>
-          <w:i w:val="0"/>
-          <w:color w:val="595959"/>
-          <w:sz w:val="21"/>
-        </w:rPr>
-        <w:t>Qlik Sense Enterprise on Windows (QSEoW)</w:t>
-      </w:r>
-    </w:p>
-    <w:p>
-      <w:pPr>
-        <w:spacing w:after="40"/>
-        <w:ind w:left="340"/>
-      </w:pPr>
-      <w:r>
-        <w:rPr>
-          <w:rFonts w:ascii="Calibri" w:hAnsi="Calibri"/>
-          <w:b/>
-          <w:i w:val="0"/>
-          <w:color w:val="009845"/>
-          <w:sz w:val="21"/>
-        </w:rPr>
-        <w:t xml:space="preserve">▪  </w:t>
-      </w:r>
-      <w:r>
-        <w:rPr>
-          <w:rFonts w:ascii="Calibri" w:hAnsi="Calibri"/>
-          <w:b w:val="0"/>
-          <w:i w:val="0"/>
-          <w:color w:val="333333"/>
-          <w:sz w:val="21"/>
-        </w:rPr>
-        <w:t xml:space="preserve">En la </w:t>
-      </w:r>
-      <w:r>
-        <w:rPr>
-          <w:rFonts w:ascii="Calibri" w:hAnsi="Calibri"/>
-          <w:b/>
-          <w:i w:val="0"/>
-          <w:color w:val="333333"/>
-          <w:sz w:val="21"/>
-        </w:rPr>
-        <w:t>QMC → Extensiones → Importar</w:t>
-      </w:r>
-      <w:r>
-        <w:rPr>
-          <w:rFonts w:ascii="Calibri" w:hAnsi="Calibri"/>
-          <w:b w:val="0"/>
-          <w:i w:val="0"/>
-          <w:color w:val="333333"/>
-          <w:sz w:val="21"/>
-        </w:rPr>
-        <w:t xml:space="preserve">, suba el archivo </w:t>
-      </w:r>
-      <w:r>
-        <w:rPr>
-          <w:rFonts w:ascii="Consolas" w:hAnsi="Consolas"/>
-          <w:b w:val="0"/>
-          <w:i w:val="0"/>
-          <w:color w:val="333333"/>
-          <w:sz w:val="21"/>
-        </w:rPr>
-        <w:t>.zip</w:t>
-      </w:r>
-      <w:r>
-        <w:rPr>
-          <w:rFonts w:ascii="Calibri" w:hAnsi="Calibri"/>
-          <w:b w:val="0"/>
-          <w:i w:val="0"/>
-          <w:color w:val="333333"/>
-          <w:sz w:val="21"/>
-        </w:rPr>
-        <w:t>. La extensión queda disponible de inmediato.</w:t>
-      </w:r>
-    </w:p>
-    <w:p>
-      <w:pPr>
-        <w:spacing w:before="140" w:after="40"/>
-      </w:pPr>
-      <w:r>
-        <w:rPr>
-          <w:rFonts w:ascii="Calibri" w:hAnsi="Calibri"/>
-          <w:b/>
-          <w:i w:val="0"/>
-          <w:color w:val="595959"/>
-          <w:sz w:val="21"/>
-        </w:rPr>
-        <w:t>Añadir el asistente a una hoja</w:t>
-      </w:r>
-    </w:p>
-    <w:p>
-      <w:pPr>
-        <w:spacing w:after="40"/>
-        <w:ind w:left="340"/>
-      </w:pPr>
-      <w:r>
-        <w:rPr>
-          <w:rFonts w:ascii="Calibri" w:hAnsi="Calibri"/>
-          <w:b/>
-          <w:i w:val="0"/>
-          <w:color w:val="009845"/>
-          <w:sz w:val="21"/>
-        </w:rPr>
-        <w:t xml:space="preserve">▪  </w:t>
-      </w:r>
-      <w:r>
-        <w:rPr>
-          <w:rFonts w:ascii="Calibri" w:hAnsi="Calibri"/>
-          <w:b w:val="0"/>
-          <w:i w:val="0"/>
-          <w:color w:val="333333"/>
-          <w:sz w:val="21"/>
-        </w:rPr>
-        <w:t xml:space="preserve">Abra una app en </w:t>
-      </w:r>
-      <w:r>
-        <w:rPr>
-          <w:rFonts w:ascii="Calibri" w:hAnsi="Calibri"/>
-          <w:b/>
-          <w:i w:val="0"/>
-          <w:color w:val="333333"/>
-          <w:sz w:val="21"/>
-        </w:rPr>
-        <w:t>modo edición</w:t>
-      </w:r>
-      <w:r>
-        <w:rPr>
-          <w:rFonts w:ascii="Calibri" w:hAnsi="Calibri"/>
-          <w:b w:val="0"/>
-          <w:i w:val="0"/>
-          <w:color w:val="333333"/>
-          <w:sz w:val="21"/>
-        </w:rPr>
-        <w:t>, busque la visualización «</w:t>
-      </w:r>
-      <w:r>
-        <w:rPr>
-          <w:rFonts w:ascii="Calibri" w:hAnsi="Calibri"/>
-          <w:b/>
-          <w:i w:val="0"/>
-          <w:color w:val="333333"/>
-          <w:sz w:val="21"/>
-        </w:rPr>
-        <w:t>Anthropic AI Assistant</w:t>
-      </w:r>
-      <w:r>
-        <w:rPr>
-          <w:rFonts w:ascii="Calibri" w:hAnsi="Calibri"/>
-          <w:b w:val="0"/>
-          <w:i w:val="0"/>
-          <w:color w:val="333333"/>
-          <w:sz w:val="21"/>
-        </w:rPr>
-        <w:t>» y arrástrela a la hoja. Aparecerá un panel flotante anclado al cuadro de mando.</w:t>
-      </w:r>
-    </w:p>
-    <w:p>
-      <w:pPr>
-        <w:spacing w:before="280" w:after="120"/>
-        <w:pBdr>
-          <w:bottom w:val="single" w:sz="12" w:space="4" w:color="D7DCD9"/>
-        </w:pBdr>
-      </w:pPr>
-      <w:r>
-        <w:rPr>
-          <w:rFonts w:ascii="Calibri" w:hAnsi="Calibri"/>
-          <w:b/>
-          <w:i w:val="0"/>
-          <w:color w:val="007A38"/>
-          <w:sz w:val="32"/>
-        </w:rPr>
-        <w:t>4. Configuración inicial (panel de propiedades)</w:t>
-      </w:r>
-    </w:p>
-    <w:p>
-      <w:pPr>
-        <w:spacing w:after="100"/>
-      </w:pPr>
-      <w:r>
-        <w:rPr>
-          <w:rFonts w:ascii="Calibri" w:hAnsi="Calibri"/>
-          <w:b w:val="0"/>
-          <w:i w:val="0"/>
-          <w:color w:val="333333"/>
-          <w:sz w:val="21"/>
-        </w:rPr>
-        <w:t>En el panel de propiedades del objeto, sección «</w:t>
-      </w:r>
-      <w:r>
-        <w:rPr>
-          <w:rFonts w:ascii="Calibri" w:hAnsi="Calibri"/>
-          <w:b/>
-          <w:i w:val="0"/>
-          <w:color w:val="333333"/>
-          <w:sz w:val="21"/>
-        </w:rPr>
-        <w:t>Anthropic AI Settings</w:t>
-      </w:r>
-      <w:r>
-        <w:rPr>
-          <w:rFonts w:ascii="Calibri" w:hAnsi="Calibri"/>
-          <w:b w:val="0"/>
-          <w:i w:val="0"/>
-          <w:color w:val="333333"/>
-          <w:sz w:val="21"/>
-        </w:rPr>
-        <w:t>», configure:</w:t>
-      </w:r>
-    </w:p>
-    <w:tbl>
-      <w:tblPr>
-        <w:tblStyle w:val="TableGrid"/>
-        <w:tblW w:type="auto" w:w="0"/>
-        <w:jc w:val="left"/>
-        <w:tblLayout w:type="fixed"/>
-        <w:tblLook w:firstColumn="1" w:firstRow="1" w:lastColumn="0" w:lastRow="0" w:noHBand="0" w:noVBand="1" w:val="04A0"/>
-      </w:tblPr>
-      <w:tblGrid>
-        <w:gridCol w:w="4986"/>
-        <w:gridCol w:w="4986"/>
-      </w:tblGrid>
-      <w:tr>
-        <w:tc>
-          <w:tcPr>
-            <w:tcW w:type="dxa" w:w="2608"/>
-            <w:shd w:val="clear" w:color="auto" w:fill="009845"/>
-          </w:tcPr>
-          <w:p>
-            <w:pPr>
-              <w:spacing w:after="20"/>
-            </w:pPr>
-            <w:r>
-              <w:rPr>
-                <w:rFonts w:ascii="Calibri" w:hAnsi="Calibri"/>
-                <w:b/>
-                <w:i w:val="0"/>
-                <w:color w:val="FFFFFF"/>
-                <w:sz w:val="19"/>
               </w:rPr>
               <w:t>Propiedad</w:t>
             </w:r>
@@ -1156,20 +440,16 @@
         </w:tc>
         <w:tc>
           <w:tcPr>
-            <w:tcW w:type="dxa" w:w="7030"/>
-            <w:shd w:val="clear" w:color="auto" w:fill="009845"/>
+            <w:tcW w:type="dxa" w:w="4824"/>
+            <w:shd w:val="clear" w:fill="C15F3C"/>
           </w:tcPr>
           <w:p>
-            <w:pPr>
-              <w:spacing w:after="20"/>
-            </w:pPr>
+            <w:r/>
             <w:r>
               <w:rPr>
-                <w:rFonts w:ascii="Calibri" w:hAnsi="Calibri"/>
                 <w:b/>
-                <w:i w:val="0"/>
                 <w:color w:val="FFFFFF"/>
-                <w:sz w:val="19"/>
+                <w:sz w:val="20"/>
               </w:rPr>
               <w:t>Descripción</w:t>
             </w:r>
@@ -1179,41 +459,31 @@
       <w:tr>
         <w:tc>
           <w:tcPr>
-            <w:tcW w:type="dxa" w:w="2608"/>
+            <w:tcW w:type="dxa" w:w="4824"/>
           </w:tcPr>
           <w:p>
-            <w:pPr>
-              <w:spacing w:after="20"/>
-            </w:pPr>
+            <w:r/>
             <w:r>
               <w:rPr>
-                <w:rFonts w:ascii="Calibri" w:hAnsi="Calibri"/>
                 <w:b w:val="0"/>
-                <w:i w:val="0"/>
-                <w:color w:val="333333"/>
-                <w:sz w:val="18"/>
+                <w:sz w:val="19"/>
               </w:rPr>
-              <w:t>API key</w:t>
+              <w:t>Default model</w:t>
             </w:r>
           </w:p>
         </w:tc>
         <w:tc>
           <w:tcPr>
-            <w:tcW w:type="dxa" w:w="7030"/>
+            <w:tcW w:type="dxa" w:w="4824"/>
           </w:tcPr>
           <w:p>
-            <w:pPr>
-              <w:spacing w:after="20"/>
-            </w:pPr>
+            <w:r/>
             <w:r>
               <w:rPr>
-                <w:rFonts w:ascii="Calibri" w:hAnsi="Calibri"/>
                 <w:b w:val="0"/>
-                <w:i w:val="0"/>
-                <w:color w:val="333333"/>
-                <w:sz w:val="18"/>
+                <w:sz w:val="19"/>
               </w:rPr>
-              <w:t>Su clave de API de Anthropic. Se guarda cifrada en el navegador (localStorage). Déjela en blanco para borrar la clave guardada.</w:t>
+              <w:t>Modelo con el que arranca cada sesión: “Haiku 4.5 (fast, low cost)” (predeterminado), “Sonnet 4.6 (balanced)”, “Opus 4.8 (most capable)” o un modelo local (Ministral vía Ollama). Puede cambiarlo en cualquier momento con “Pick model” en el panel.</w:t>
             </w:r>
           </w:p>
         </w:tc>
@@ -1221,43 +491,31 @@
       <w:tr>
         <w:tc>
           <w:tcPr>
-            <w:tcW w:type="dxa" w:w="2608"/>
-            <w:shd w:val="clear" w:color="auto" w:fill="F7FAF8"/>
+            <w:tcW w:type="dxa" w:w="4824"/>
           </w:tcPr>
           <w:p>
-            <w:pPr>
-              <w:spacing w:after="20"/>
-            </w:pPr>
+            <w:r/>
             <w:r>
               <w:rPr>
-                <w:rFonts w:ascii="Calibri" w:hAnsi="Calibri"/>
                 <w:b w:val="0"/>
-                <w:i w:val="0"/>
-                <w:color w:val="333333"/>
-                <w:sz w:val="18"/>
+                <w:sz w:val="19"/>
               </w:rPr>
-              <w:t>Model</w:t>
+              <w:t>Proxy URL</w:t>
             </w:r>
           </w:p>
         </w:tc>
         <w:tc>
           <w:tcPr>
-            <w:tcW w:type="dxa" w:w="7030"/>
-            <w:shd w:val="clear" w:color="auto" w:fill="F7FAF8"/>
+            <w:tcW w:type="dxa" w:w="4824"/>
           </w:tcPr>
           <w:p>
-            <w:pPr>
-              <w:spacing w:after="20"/>
-            </w:pPr>
+            <w:r/>
             <w:r>
               <w:rPr>
-                <w:rFonts w:ascii="Calibri" w:hAnsi="Calibri"/>
                 <w:b w:val="0"/>
-                <w:i w:val="0"/>
-                <w:color w:val="333333"/>
-                <w:sz w:val="18"/>
+                <w:sz w:val="19"/>
               </w:rPr>
-              <w:t>Modelo a utilizar: «Haiku 4.5 (fast, low cost)» (predeterminado), «Sonnet 4.6 (balanced)» o «Opus 4.8 (most capable)».</w:t>
+              <w:t>OBLIGATORIA. URL del proxy endurecido que guarda la clave y valida su sesión de Qlik, p. ej. https://su-host-qlik:3000/api/anthropic. Déjela en blanco para usar el valor por defecto de config.js.</w:t>
             </w:r>
           </w:p>
         </w:tc>
@@ -1265,41 +523,31 @@
       <w:tr>
         <w:tc>
           <w:tcPr>
-            <w:tcW w:type="dxa" w:w="2608"/>
+            <w:tcW w:type="dxa" w:w="4824"/>
           </w:tcPr>
           <w:p>
-            <w:pPr>
-              <w:spacing w:after="20"/>
-            </w:pPr>
+            <w:r/>
             <w:r>
               <w:rPr>
-                <w:rFonts w:ascii="Calibri" w:hAnsi="Calibri"/>
                 <w:b w:val="0"/>
-                <w:i w:val="0"/>
-                <w:color w:val="333333"/>
-                <w:sz w:val="18"/>
+                <w:sz w:val="19"/>
               </w:rPr>
-              <w:t>Proxy URL (optional)</w:t>
+              <w:t>Local model URL</w:t>
             </w:r>
           </w:p>
         </w:tc>
         <w:tc>
           <w:tcPr>
-            <w:tcW w:type="dxa" w:w="7030"/>
+            <w:tcW w:type="dxa" w:w="4824"/>
           </w:tcPr>
           <w:p>
-            <w:pPr>
-              <w:spacing w:after="20"/>
-            </w:pPr>
+            <w:r/>
             <w:r>
               <w:rPr>
-                <w:rFonts w:ascii="Calibri" w:hAnsi="Calibri"/>
                 <w:b w:val="0"/>
-                <w:i w:val="0"/>
-                <w:color w:val="333333"/>
-                <w:sz w:val="18"/>
+                <w:sz w:val="19"/>
               </w:rPr>
-              <w:t>Opcional. Déjelo en blanco para llamar a la API directamente. Indique la URL de un proxy local solo si su red bloquea la salida directa.</w:t>
+              <w:t>Endpoint de Ollama a través del proxy HTTPS, usado cuando se selecciona un modelo local. Debe ser HTTPS en QSEoW, p. ej. https://localhost:3000/api/ollama.</w:t>
             </w:r>
           </w:p>
         </w:tc>
@@ -1307,20 +555,46 @@
       <w:tr>
         <w:tc>
           <w:tcPr>
-            <w:tcW w:type="dxa" w:w="2608"/>
-            <w:shd w:val="clear" w:color="auto" w:fill="F7FAF8"/>
+            <w:tcW w:type="dxa" w:w="4824"/>
           </w:tcPr>
           <w:p>
-            <w:pPr>
-              <w:spacing w:after="20"/>
-            </w:pPr>
+            <w:r/>
             <w:r>
               <w:rPr>
-                <w:rFonts w:ascii="Calibri" w:hAnsi="Calibri"/>
                 <w:b w:val="0"/>
-                <w:i w:val="0"/>
-                <w:color w:val="333333"/>
-                <w:sz w:val="18"/>
+                <w:sz w:val="19"/>
+              </w:rPr>
+              <w:t>Log level</w:t>
+            </w:r>
+          </w:p>
+        </w:tc>
+        <w:tc>
+          <w:tcPr>
+            <w:tcW w:type="dxa" w:w="4824"/>
+          </w:tcPr>
+          <w:p>
+            <w:r/>
+            <w:r>
+              <w:rPr>
+                <w:b w:val="0"/>
+                <w:sz w:val="19"/>
+              </w:rPr>
+              <w:t>Verbosidad de la consola del navegador: ERROR (solo errores), WARN (errores y avisos), INFO (además, acciones aceptadas) o DEBUG (todo). Baje a WARN/ERROR una vez superada la fase de pruebas.</w:t>
+            </w:r>
+          </w:p>
+        </w:tc>
+      </w:tr>
+      <w:tr>
+        <w:tc>
+          <w:tcPr>
+            <w:tcW w:type="dxa" w:w="4824"/>
+          </w:tcPr>
+          <w:p>
+            <w:r/>
+            <w:r>
+              <w:rPr>
+                <w:b w:val="0"/>
+                <w:sz w:val="19"/>
               </w:rPr>
               <w:t>Versión</w:t>
             </w:r>
@@ -1328,1371 +602,335 @@
         </w:tc>
         <w:tc>
           <w:tcPr>
-            <w:tcW w:type="dxa" w:w="7030"/>
-            <w:shd w:val="clear" w:color="auto" w:fill="F7FAF8"/>
+            <w:tcW w:type="dxa" w:w="4824"/>
           </w:tcPr>
           <w:p>
-            <w:pPr>
-              <w:spacing w:after="20"/>
-            </w:pPr>
+            <w:r/>
             <w:r>
               <w:rPr>
-                <w:rFonts w:ascii="Calibri" w:hAnsi="Calibri"/>
                 <w:b w:val="0"/>
-                <w:i w:val="0"/>
-                <w:color w:val="333333"/>
-                <w:sz w:val="18"/>
+                <w:sz w:val="19"/>
               </w:rPr>
-              <w:t>Campo de solo lectura: «Version 0.3.3 · build 24».</w:t>
+              <w:t>Campo de solo lectura: “Version 0.5.0 · build 34”.</w:t>
             </w:r>
           </w:p>
         </w:tc>
       </w:tr>
     </w:tbl>
+    <w:p/>
     <w:p>
-      <w:pPr>
-        <w:spacing w:after="80"/>
-      </w:pPr>
       <w:r>
-        <w:rPr>
-          <w:rFonts w:ascii="Calibri" w:hAnsi="Calibri"/>
-          <w:b w:val="0"/>
-          <w:i/>
-          <w:color w:val="595959"/>
-          <w:sz w:val="18"/>
-        </w:rPr>
-        <w:t>La clave se comparte entre todas las apps del mismo navegador. Si no hay clave configurada, al enviar verá: «API key not found. Please enter your Anthropic API key in the settings.»</w:t>
+        <w:t>Ya no existe ninguna propiedad de “API key”: la clave vive únicamente en el proxy. Si la URL del proxy no está configurada, al enviar verá el mensaje: “Proxy URL is not configured. Set it in Edit object → Settings.”</w:t>
       </w:r>
     </w:p>
     <w:p>
       <w:r>
-        <w:br w:type="page"/>
-      </w:r>
-    </w:p>
-    <w:p>
-      <w:pPr>
-        <w:spacing w:before="280" w:after="120"/>
-        <w:pBdr>
-          <w:bottom w:val="single" w:sz="12" w:space="4" w:color="D7DCD9"/>
-        </w:pBdr>
-      </w:pPr>
-      <w:r>
         <w:rPr>
-          <w:rFonts w:ascii="Calibri" w:hAnsi="Calibri"/>
           <w:b/>
-          <w:i w:val="0"/>
-          <w:color w:val="007A38"/>
-          <w:sz w:val="32"/>
+          <w:color w:val="C15F3C"/>
+          <w:sz w:val="30"/>
         </w:rPr>
         <w:t>5. Recorrido de la interfaz</w:t>
       </w:r>
     </w:p>
     <w:p>
       <w:pPr>
-        <w:spacing w:after="40"/>
-        <w:ind w:left="340"/>
+        <w:pStyle w:val="ListBullet"/>
       </w:pPr>
       <w:r>
-        <w:rPr>
-          <w:rFonts w:ascii="Calibri" w:hAnsi="Calibri"/>
-          <w:b/>
-          <w:i w:val="0"/>
-          <w:color w:val="009845"/>
-          <w:sz w:val="21"/>
-        </w:rPr>
-        <w:t xml:space="preserve">▪  </w:t>
-      </w:r>
-      <w:r>
-        <w:rPr>
-          <w:rFonts w:ascii="Calibri" w:hAnsi="Calibri"/>
-          <w:b/>
-          <w:i w:val="0"/>
-          <w:color w:val="333333"/>
-          <w:sz w:val="21"/>
-        </w:rPr>
-        <w:t>Botón flotante verde</w:t>
-      </w:r>
-      <w:r>
-        <w:rPr>
-          <w:rFonts w:ascii="Calibri" w:hAnsi="Calibri"/>
-          <w:b w:val="0"/>
-          <w:i w:val="0"/>
-          <w:color w:val="333333"/>
-          <w:sz w:val="21"/>
-        </w:rPr>
-        <w:t xml:space="preserve"> (esquina inferior derecha): abre y cierra el panel.</w:t>
+        <w:t>Botón flotante (esquina inferior derecha): abre y cierra el panel.</w:t>
       </w:r>
     </w:p>
     <w:p>
       <w:pPr>
-        <w:spacing w:after="40"/>
-        <w:ind w:left="340"/>
+        <w:pStyle w:val="ListBullet"/>
       </w:pPr>
       <w:r>
-        <w:rPr>
-          <w:rFonts w:ascii="Calibri" w:hAnsi="Calibri"/>
-          <w:b/>
-          <w:i w:val="0"/>
-          <w:color w:val="009845"/>
-          <w:sz w:val="21"/>
-        </w:rPr>
-        <w:t xml:space="preserve">▪  </w:t>
-      </w:r>
-      <w:r>
-        <w:rPr>
-          <w:rFonts w:ascii="Calibri" w:hAnsi="Calibri"/>
-          <w:b/>
-          <w:i w:val="0"/>
-          <w:color w:val="333333"/>
-          <w:sz w:val="21"/>
-        </w:rPr>
-        <w:t>Cabecera «AI Assistant»</w:t>
-      </w:r>
-      <w:r>
-        <w:rPr>
-          <w:rFonts w:ascii="Calibri" w:hAnsi="Calibri"/>
-          <w:b w:val="0"/>
-          <w:i w:val="0"/>
-          <w:color w:val="333333"/>
-          <w:sz w:val="21"/>
-        </w:rPr>
-        <w:t xml:space="preserve"> con botón de cierre «×».</w:t>
+        <w:t>Cabecera “AI Assistant” con botón de cierre “X”.</w:t>
       </w:r>
     </w:p>
     <w:p>
       <w:pPr>
-        <w:spacing w:after="40"/>
-        <w:ind w:left="340"/>
+        <w:pStyle w:val="ListBullet"/>
       </w:pPr>
       <w:r>
-        <w:rPr>
-          <w:rFonts w:ascii="Calibri" w:hAnsi="Calibri"/>
-          <w:b/>
-          <w:i w:val="0"/>
-          <w:color w:val="009845"/>
-          <w:sz w:val="21"/>
-        </w:rPr>
-        <w:t xml:space="preserve">▪  </w:t>
-      </w:r>
-      <w:r>
-        <w:rPr>
-          <w:rFonts w:ascii="Calibri" w:hAnsi="Calibri"/>
-          <w:b/>
-          <w:i w:val="0"/>
-          <w:color w:val="333333"/>
-          <w:sz w:val="21"/>
-        </w:rPr>
-        <w:t>Estado de la clave de API</w:t>
-      </w:r>
-      <w:r>
-        <w:rPr>
-          <w:rFonts w:ascii="Calibri" w:hAnsi="Calibri"/>
-          <w:b w:val="0"/>
-          <w:i w:val="0"/>
-          <w:color w:val="333333"/>
-          <w:sz w:val="21"/>
-        </w:rPr>
-        <w:t>: avisa si falta configurarla.</w:t>
+        <w:t>Estado de conexión: indica el proxy/endpoint configurado.</w:t>
       </w:r>
     </w:p>
     <w:p>
       <w:pPr>
-        <w:spacing w:after="40"/>
-        <w:ind w:left="340"/>
+        <w:pStyle w:val="ListBullet"/>
       </w:pPr>
       <w:r>
-        <w:rPr>
-          <w:rFonts w:ascii="Calibri" w:hAnsi="Calibri"/>
-          <w:b/>
-          <w:i w:val="0"/>
-          <w:color w:val="009845"/>
-          <w:sz w:val="21"/>
-        </w:rPr>
-        <w:t xml:space="preserve">▪  </w:t>
-      </w:r>
-      <w:r>
-        <w:rPr>
-          <w:rFonts w:ascii="Calibri" w:hAnsi="Calibri"/>
-          <w:b/>
-          <w:i w:val="0"/>
-          <w:color w:val="333333"/>
-          <w:sz w:val="21"/>
-        </w:rPr>
-        <w:t>«Chart Selection»</w:t>
-      </w:r>
-      <w:r>
-        <w:rPr>
-          <w:rFonts w:ascii="Calibri" w:hAnsi="Calibri"/>
-          <w:b w:val="0"/>
-          <w:i w:val="0"/>
-          <w:color w:val="333333"/>
-          <w:sz w:val="21"/>
-        </w:rPr>
-        <w:t>: botones «Add Chart» y «Clear All», y las fichas (chips) de los gráficos seleccionados.</w:t>
+        <w:t>“Chart Selection”: botones “Add Chart” y “Clear All”, y las fichas (chips) de los gráficos seleccionados, hasta 5. Se pueden seleccionar gráficos de distintas hojas: el panel es un elemento persistente y permanece abierto al navegar por la aplicación.</w:t>
       </w:r>
     </w:p>
     <w:p>
       <w:pPr>
-        <w:spacing w:after="40"/>
-        <w:ind w:left="340"/>
+        <w:pStyle w:val="ListBullet"/>
       </w:pPr>
       <w:r>
-        <w:rPr>
-          <w:rFonts w:ascii="Calibri" w:hAnsi="Calibri"/>
-          <w:b/>
-          <w:i w:val="0"/>
-          <w:color w:val="009845"/>
-          <w:sz w:val="21"/>
-        </w:rPr>
-        <w:t xml:space="preserve">▪  </w:t>
-      </w:r>
-      <w:r>
-        <w:rPr>
-          <w:rFonts w:ascii="Calibri" w:hAnsi="Calibri"/>
-          <w:b/>
-          <w:i w:val="0"/>
-          <w:color w:val="333333"/>
-          <w:sz w:val="21"/>
-        </w:rPr>
-        <w:t>«Ask about your data:»</w:t>
-      </w:r>
-      <w:r>
-        <w:rPr>
-          <w:rFonts w:ascii="Calibri" w:hAnsi="Calibri"/>
-          <w:b w:val="0"/>
-          <w:i w:val="0"/>
-          <w:color w:val="333333"/>
-          <w:sz w:val="21"/>
-        </w:rPr>
-        <w:t>: el área de texto donde escribe su pregunta.</w:t>
+        <w:t>“Ask about your data:”: el área de texto donde escribe su pregunta (prompt).</w:t>
       </w:r>
     </w:p>
     <w:p>
       <w:pPr>
-        <w:spacing w:after="40"/>
-        <w:ind w:left="340"/>
+        <w:pStyle w:val="ListBullet"/>
       </w:pPr>
       <w:r>
-        <w:rPr>
-          <w:rFonts w:ascii="Calibri" w:hAnsi="Calibri"/>
-          <w:b/>
-          <w:i w:val="0"/>
-          <w:color w:val="009845"/>
-          <w:sz w:val="21"/>
-        </w:rPr>
-        <w:t xml:space="preserve">▪  </w:t>
-      </w:r>
-      <w:r>
-        <w:rPr>
-          <w:rFonts w:ascii="Calibri" w:hAnsi="Calibri"/>
-          <w:b/>
-          <w:i w:val="0"/>
-          <w:color w:val="333333"/>
-          <w:sz w:val="21"/>
-        </w:rPr>
-        <w:t>«Advanced Options»</w:t>
-      </w:r>
-      <w:r>
-        <w:rPr>
-          <w:rFonts w:ascii="Calibri" w:hAnsi="Calibri"/>
-          <w:b w:val="0"/>
-          <w:i w:val="0"/>
-          <w:color w:val="333333"/>
-          <w:sz w:val="21"/>
-        </w:rPr>
-        <w:t>: ajustes de datos y estilo de análisis (desplegable).</w:t>
+        <w:t>“Pick model”: selector de modelo en el propio panel (cambia el modelo de la conversación).</w:t>
       </w:r>
     </w:p>
     <w:p>
       <w:pPr>
-        <w:spacing w:after="40"/>
-        <w:ind w:left="340"/>
+        <w:pStyle w:val="ListBullet"/>
       </w:pPr>
       <w:r>
-        <w:rPr>
-          <w:rFonts w:ascii="Calibri" w:hAnsi="Calibri"/>
-          <w:b/>
-          <w:i w:val="0"/>
-          <w:color w:val="009845"/>
-          <w:sz w:val="21"/>
-        </w:rPr>
-        <w:t xml:space="preserve">▪  </w:t>
-      </w:r>
-      <w:r>
-        <w:rPr>
-          <w:rFonts w:ascii="Calibri" w:hAnsi="Calibri"/>
-          <w:b/>
-          <w:i w:val="0"/>
-          <w:color w:val="333333"/>
-          <w:sz w:val="21"/>
-        </w:rPr>
-        <w:t>«AI Conversation»</w:t>
-      </w:r>
-      <w:r>
-        <w:rPr>
-          <w:rFonts w:ascii="Calibri" w:hAnsi="Calibri"/>
-          <w:b w:val="0"/>
-          <w:i w:val="0"/>
-          <w:color w:val="333333"/>
-          <w:sz w:val="21"/>
-        </w:rPr>
-        <w:t>: el hilo de la conversación, con botón «New chat».</w:t>
+        <w:t>“Advanced Options”: ajustes de datos, estilo de análisis y streaming (desplegable).</w:t>
       </w:r>
     </w:p>
     <w:p>
       <w:pPr>
-        <w:spacing w:after="40"/>
-        <w:ind w:left="340"/>
+        <w:pStyle w:val="ListBullet"/>
       </w:pPr>
       <w:r>
-        <w:rPr>
-          <w:rFonts w:ascii="Calibri" w:hAnsi="Calibri"/>
-          <w:b/>
-          <w:i w:val="0"/>
-          <w:color w:val="009845"/>
-          <w:sz w:val="21"/>
-        </w:rPr>
-        <w:t xml:space="preserve">▪  </w:t>
-      </w:r>
-      <w:r>
-        <w:rPr>
-          <w:rFonts w:ascii="Calibri" w:hAnsi="Calibri"/>
-          <w:b/>
-          <w:i w:val="0"/>
-          <w:color w:val="333333"/>
-          <w:sz w:val="21"/>
-        </w:rPr>
-        <w:t>Pie</w:t>
-      </w:r>
-      <w:r>
-        <w:rPr>
-          <w:rFonts w:ascii="Calibri" w:hAnsi="Calibri"/>
-          <w:b w:val="0"/>
-          <w:i w:val="0"/>
-          <w:color w:val="333333"/>
-          <w:sz w:val="21"/>
-        </w:rPr>
-        <w:t>: «v0.3.3 · build 24 · mabaeyens».</w:t>
+        <w:t>“AI Conversation”: el hilo de la conversación, con botón “New chat” para empezar de nuevo.</w:t>
       </w:r>
     </w:p>
     <w:p>
-      <w:pPr>
-        <w:spacing w:before="280" w:after="120"/>
-        <w:pBdr>
-          <w:bottom w:val="single" w:sz="12" w:space="4" w:color="D7DCD9"/>
-        </w:pBdr>
-      </w:pPr>
       <w:r>
         <w:rPr>
-          <w:rFonts w:ascii="Calibri" w:hAnsi="Calibri"/>
           <w:b/>
-          <w:i w:val="0"/>
-          <w:color w:val="007A38"/>
-          <w:sz w:val="32"/>
+          <w:color w:val="C15F3C"/>
+          <w:sz w:val="30"/>
         </w:rPr>
         <w:t>6. Cómo usarlo, paso a paso</w:t>
       </w:r>
     </w:p>
     <w:p>
-      <w:pPr>
-        <w:spacing w:before="200" w:after="60"/>
-      </w:pPr>
       <w:r>
         <w:rPr>
-          <w:rFonts w:ascii="Calibri" w:hAnsi="Calibri"/>
           <w:b/>
-          <w:i w:val="0"/>
-          <w:color w:val="333333"/>
-          <w:sz w:val="25"/>
+          <w:color w:val="2E3440"/>
+          <w:sz w:val="24"/>
         </w:rPr>
         <w:t>6.1 Seleccionar uno o varios gráficos</w:t>
       </w:r>
     </w:p>
     <w:p>
       <w:pPr>
-        <w:spacing w:after="40"/>
-        <w:ind w:left="340"/>
+        <w:pStyle w:val="ListBullet"/>
       </w:pPr>
       <w:r>
-        <w:rPr>
-          <w:rFonts w:ascii="Calibri" w:hAnsi="Calibri"/>
-          <w:b/>
-          <w:i w:val="0"/>
-          <w:color w:val="009845"/>
-          <w:sz w:val="21"/>
-        </w:rPr>
-        <w:t xml:space="preserve">▪  </w:t>
-      </w:r>
-      <w:r>
-        <w:rPr>
-          <w:rFonts w:ascii="Calibri" w:hAnsi="Calibri"/>
-          <w:b w:val="0"/>
-          <w:i w:val="0"/>
-          <w:color w:val="333333"/>
-          <w:sz w:val="21"/>
-        </w:rPr>
-        <w:t>Pulse «</w:t>
-      </w:r>
-      <w:r>
-        <w:rPr>
-          <w:rFonts w:ascii="Calibri" w:hAnsi="Calibri"/>
-          <w:b/>
-          <w:i w:val="0"/>
-          <w:color w:val="333333"/>
-          <w:sz w:val="21"/>
-        </w:rPr>
-        <w:t>Add Chart</w:t>
-      </w:r>
-      <w:r>
-        <w:rPr>
-          <w:rFonts w:ascii="Calibri" w:hAnsi="Calibri"/>
-          <w:b w:val="0"/>
-          <w:i w:val="0"/>
-          <w:color w:val="333333"/>
-          <w:sz w:val="21"/>
-        </w:rPr>
-        <w:t>»; el botón cambia a «</w:t>
-      </w:r>
-      <w:r>
-        <w:rPr>
-          <w:rFonts w:ascii="Calibri" w:hAnsi="Calibri"/>
-          <w:b/>
-          <w:i w:val="0"/>
-          <w:color w:val="333333"/>
-          <w:sz w:val="21"/>
-        </w:rPr>
-        <w:t>Cancel</w:t>
-      </w:r>
-      <w:r>
-        <w:rPr>
-          <w:rFonts w:ascii="Calibri" w:hAnsi="Calibri"/>
-          <w:b w:val="0"/>
-          <w:i w:val="0"/>
-          <w:color w:val="333333"/>
-          <w:sz w:val="21"/>
-        </w:rPr>
-        <w:t>» y se activa el modo de selección (la pista indica «Click a chart to add it»).</w:t>
+        <w:t>Pulse “Add Chart”; el botón cambia a “Cancel” y se activa el modo de selección (la pista indica “Click a chart to add it”).</w:t>
       </w:r>
     </w:p>
     <w:p>
       <w:pPr>
-        <w:spacing w:after="40"/>
-        <w:ind w:left="340"/>
+        <w:pStyle w:val="ListBullet"/>
       </w:pPr>
       <w:r>
-        <w:rPr>
-          <w:rFonts w:ascii="Calibri" w:hAnsi="Calibri"/>
-          <w:b/>
-          <w:i w:val="0"/>
-          <w:color w:val="009845"/>
-          <w:sz w:val="21"/>
-        </w:rPr>
-        <w:t xml:space="preserve">▪  </w:t>
-      </w:r>
-      <w:r>
-        <w:rPr>
-          <w:rFonts w:ascii="Calibri" w:hAnsi="Calibri"/>
-          <w:b w:val="0"/>
-          <w:i w:val="0"/>
-          <w:color w:val="333333"/>
-          <w:sz w:val="21"/>
-        </w:rPr>
-        <w:t>Haga clic en un gráfico del cuadro de mando: aparece como una ficha con su título y una «×» para quitarlo.</w:t>
+        <w:t>Haga clic en un gráfico del cuadro de mando: aparece como una ficha con su título y una “×” para quitarlo.</w:t>
       </w:r>
     </w:p>
     <w:p>
       <w:pPr>
-        <w:spacing w:after="40"/>
-        <w:ind w:left="340"/>
+        <w:pStyle w:val="ListBullet"/>
       </w:pPr>
       <w:r>
-        <w:rPr>
-          <w:rFonts w:ascii="Calibri" w:hAnsi="Calibri"/>
-          <w:b/>
-          <w:i w:val="0"/>
-          <w:color w:val="009845"/>
-          <w:sz w:val="21"/>
-        </w:rPr>
-        <w:t xml:space="preserve">▪  </w:t>
-      </w:r>
-      <w:r>
-        <w:rPr>
-          <w:rFonts w:ascii="Calibri" w:hAnsi="Calibri"/>
-          <w:b w:val="0"/>
-          <w:i w:val="0"/>
-          <w:color w:val="333333"/>
-          <w:sz w:val="21"/>
-        </w:rPr>
-        <w:t xml:space="preserve">Puede seleccionar hasta </w:t>
-      </w:r>
-      <w:r>
-        <w:rPr>
-          <w:rFonts w:ascii="Calibri" w:hAnsi="Calibri"/>
-          <w:b/>
-          <w:i w:val="0"/>
-          <w:color w:val="333333"/>
-          <w:sz w:val="21"/>
-        </w:rPr>
-        <w:t>5 gráficos</w:t>
-      </w:r>
-      <w:r>
-        <w:rPr>
-          <w:rFonts w:ascii="Calibri" w:hAnsi="Calibri"/>
-          <w:b w:val="0"/>
-          <w:i w:val="0"/>
-          <w:color w:val="333333"/>
-          <w:sz w:val="21"/>
-        </w:rPr>
-        <w:t>. Al alcanzar el límite verá «Maximum 5 charts.».</w:t>
+        <w:t>Puede seleccionar hasta 5 gráficos. Al alcanzar el límite verá “Maximum 5 charts.”.</w:t>
       </w:r>
     </w:p>
     <w:p>
       <w:pPr>
-        <w:spacing w:after="40"/>
-        <w:ind w:left="340"/>
+        <w:pStyle w:val="ListBullet"/>
       </w:pPr>
       <w:r>
-        <w:rPr>
-          <w:rFonts w:ascii="Calibri" w:hAnsi="Calibri"/>
-          <w:b/>
-          <w:i w:val="0"/>
-          <w:color w:val="009845"/>
-          <w:sz w:val="21"/>
-        </w:rPr>
-        <w:t xml:space="preserve">▪  </w:t>
-      </w:r>
-      <w:r>
-        <w:rPr>
-          <w:rFonts w:ascii="Calibri" w:hAnsi="Calibri"/>
-          <w:b w:val="0"/>
-          <w:i w:val="0"/>
-          <w:color w:val="333333"/>
-          <w:sz w:val="21"/>
-        </w:rPr>
-        <w:t>«</w:t>
-      </w:r>
-      <w:r>
-        <w:rPr>
-          <w:rFonts w:ascii="Calibri" w:hAnsi="Calibri"/>
-          <w:b/>
-          <w:i w:val="0"/>
-          <w:color w:val="333333"/>
-          <w:sz w:val="21"/>
-        </w:rPr>
-        <w:t>Clear All</w:t>
-      </w:r>
-      <w:r>
-        <w:rPr>
-          <w:rFonts w:ascii="Calibri" w:hAnsi="Calibri"/>
-          <w:b w:val="0"/>
-          <w:i w:val="0"/>
-          <w:color w:val="333333"/>
-          <w:sz w:val="21"/>
-        </w:rPr>
-        <w:t>» quita todos los gráficos. Sin selección, la pista muestra «No charts selected».</w:t>
+        <w:t>“Clear All” quita todos los gráficos. Sin selección, la pista muestra “No charts selected”.</w:t>
       </w:r>
     </w:p>
     <w:p>
-      <w:pPr>
-        <w:spacing w:before="200" w:after="60"/>
-      </w:pPr>
       <w:r>
         <w:rPr>
-          <w:rFonts w:ascii="Calibri" w:hAnsi="Calibri"/>
           <w:b/>
-          <w:i w:val="0"/>
-          <w:color w:val="333333"/>
-          <w:sz w:val="25"/>
+          <w:color w:val="2E3440"/>
+          <w:sz w:val="24"/>
         </w:rPr>
         <w:t>6.2 Hacer una pregunta</w:t>
       </w:r>
     </w:p>
     <w:p>
       <w:pPr>
-        <w:spacing w:after="40"/>
-        <w:ind w:left="340"/>
+        <w:pStyle w:val="ListBullet"/>
       </w:pPr>
       <w:r>
-        <w:rPr>
-          <w:rFonts w:ascii="Calibri" w:hAnsi="Calibri"/>
-          <w:b/>
-          <w:i w:val="0"/>
-          <w:color w:val="009845"/>
-          <w:sz w:val="21"/>
-        </w:rPr>
-        <w:t xml:space="preserve">▪  </w:t>
-      </w:r>
-      <w:r>
-        <w:rPr>
-          <w:rFonts w:ascii="Calibri" w:hAnsi="Calibri"/>
-          <w:b w:val="0"/>
-          <w:i w:val="0"/>
-          <w:color w:val="333333"/>
-          <w:sz w:val="21"/>
-        </w:rPr>
-        <w:t>Escriba su pregunta en «Ask about your data:» (p. ej. «¿Cuáles son los 5 clientes con mayor facturación?»).</w:t>
+        <w:t>Escriba su pregunta en “Ask about your data:” (p. ej. “¿Cuáles son los 5 clientes con mayor facturación?”).</w:t>
       </w:r>
     </w:p>
     <w:p>
       <w:pPr>
-        <w:spacing w:after="40"/>
-        <w:ind w:left="340"/>
+        <w:pStyle w:val="ListBullet"/>
       </w:pPr>
       <w:r>
-        <w:rPr>
-          <w:rFonts w:ascii="Calibri" w:hAnsi="Calibri"/>
-          <w:b/>
-          <w:i w:val="0"/>
-          <w:color w:val="009845"/>
-          <w:sz w:val="21"/>
-        </w:rPr>
-        <w:t xml:space="preserve">▪  </w:t>
-      </w:r>
-      <w:r>
-        <w:rPr>
-          <w:rFonts w:ascii="Calibri" w:hAnsi="Calibri"/>
-          <w:b w:val="0"/>
-          <w:i w:val="0"/>
-          <w:color w:val="333333"/>
-          <w:sz w:val="21"/>
-        </w:rPr>
-        <w:t>Pulse «</w:t>
-      </w:r>
-      <w:r>
-        <w:rPr>
-          <w:rFonts w:ascii="Calibri" w:hAnsi="Calibri"/>
-          <w:b/>
-          <w:i w:val="0"/>
-          <w:color w:val="333333"/>
-          <w:sz w:val="21"/>
-        </w:rPr>
-        <w:t>Submit</w:t>
-      </w:r>
-      <w:r>
-        <w:rPr>
-          <w:rFonts w:ascii="Calibri" w:hAnsi="Calibri"/>
-          <w:b w:val="0"/>
-          <w:i w:val="0"/>
-          <w:color w:val="333333"/>
-          <w:sz w:val="21"/>
-        </w:rPr>
-        <w:t>». El botón se deshabilita si no hay clave de API o no hay ningún gráfico seleccionado.</w:t>
+        <w:t>Pulse “Submit”. El botón se deshabilita mientras hay una petición en curso o si no hay ningún gráfico seleccionado.</w:t>
       </w:r>
     </w:p>
     <w:p>
       <w:pPr>
-        <w:spacing w:after="40"/>
-        <w:ind w:left="340"/>
+        <w:pStyle w:val="ListBullet"/>
       </w:pPr>
       <w:r>
-        <w:rPr>
-          <w:rFonts w:ascii="Calibri" w:hAnsi="Calibri"/>
-          <w:b/>
-          <w:i w:val="0"/>
-          <w:color w:val="009845"/>
-          <w:sz w:val="21"/>
-        </w:rPr>
-        <w:t xml:space="preserve">▪  </w:t>
-      </w:r>
-      <w:r>
-        <w:rPr>
-          <w:rFonts w:ascii="Calibri" w:hAnsi="Calibri"/>
-          <w:b w:val="0"/>
-          <w:i w:val="0"/>
-          <w:color w:val="333333"/>
-          <w:sz w:val="21"/>
-        </w:rPr>
-        <w:t>Mientras Claude responde se muestra el estado «</w:t>
-      </w:r>
-      <w:r>
-        <w:rPr>
-          <w:rFonts w:ascii="Calibri" w:hAnsi="Calibri"/>
-          <w:b/>
-          <w:i w:val="0"/>
-          <w:color w:val="333333"/>
-          <w:sz w:val="21"/>
-        </w:rPr>
-        <w:t>Thinking…</w:t>
-      </w:r>
-      <w:r>
-        <w:rPr>
-          <w:rFonts w:ascii="Calibri" w:hAnsi="Calibri"/>
-          <w:b w:val="0"/>
-          <w:i w:val="0"/>
-          <w:color w:val="333333"/>
-          <w:sz w:val="21"/>
-        </w:rPr>
-        <w:t>».</w:t>
+        <w:t>Mientras Claude responde se muestra el estado “Thinking…”. Con streaming activado, la respuesta aparece token a token.</w:t>
       </w:r>
     </w:p>
     <w:p>
-      <w:pPr>
-        <w:spacing w:before="200" w:after="60"/>
-      </w:pPr>
       <w:r>
         <w:rPr>
-          <w:rFonts w:ascii="Calibri" w:hAnsi="Calibri"/>
           <w:b/>
-          <w:i w:val="0"/>
-          <w:color w:val="333333"/>
-          <w:sz w:val="25"/>
+          <w:color w:val="2E3440"/>
+          <w:sz w:val="24"/>
         </w:rPr>
         <w:t>6.3 Leer la respuesta</w:t>
       </w:r>
     </w:p>
     <w:p>
       <w:pPr>
-        <w:spacing w:after="40"/>
-        <w:ind w:left="340"/>
+        <w:pStyle w:val="ListBullet"/>
       </w:pPr>
       <w:r>
-        <w:rPr>
-          <w:rFonts w:ascii="Calibri" w:hAnsi="Calibri"/>
-          <w:b/>
-          <w:i w:val="0"/>
-          <w:color w:val="009845"/>
-          <w:sz w:val="21"/>
-        </w:rPr>
-        <w:t xml:space="preserve">▪  </w:t>
-      </w:r>
-      <w:r>
-        <w:rPr>
-          <w:rFonts w:ascii="Calibri" w:hAnsi="Calibri"/>
-          <w:b w:val="0"/>
-          <w:i w:val="0"/>
-          <w:color w:val="333333"/>
-          <w:sz w:val="21"/>
-        </w:rPr>
-        <w:t>La respuesta se muestra en el hilo, renderizada con formato Markdown (títulos, listas, negrita, código).</w:t>
+        <w:t>La respuesta se muestra en el hilo, renderizada con formato Markdown (títulos, listas, negrita, código) y saneada.</w:t>
       </w:r>
     </w:p>
     <w:p>
       <w:pPr>
-        <w:spacing w:after="40"/>
-        <w:ind w:left="340"/>
+        <w:pStyle w:val="ListBullet"/>
       </w:pPr>
       <w:r>
-        <w:rPr>
-          <w:rFonts w:ascii="Calibri" w:hAnsi="Calibri"/>
-          <w:b/>
-          <w:i w:val="0"/>
-          <w:color w:val="009845"/>
-          <w:sz w:val="21"/>
-        </w:rPr>
-        <w:t xml:space="preserve">▪  </w:t>
-      </w:r>
-      <w:r>
-        <w:rPr>
-          <w:rFonts w:ascii="Calibri" w:hAnsi="Calibri"/>
-          <w:b w:val="0"/>
-          <w:i w:val="0"/>
-          <w:color w:val="333333"/>
-          <w:sz w:val="21"/>
-        </w:rPr>
-        <w:t>Cada respuesta incluye un botón «</w:t>
-      </w:r>
-      <w:r>
-        <w:rPr>
-          <w:rFonts w:ascii="Calibri" w:hAnsi="Calibri"/>
-          <w:b/>
-          <w:i w:val="0"/>
-          <w:color w:val="333333"/>
-          <w:sz w:val="21"/>
-        </w:rPr>
-        <w:t>Copy</w:t>
-      </w:r>
-      <w:r>
-        <w:rPr>
-          <w:rFonts w:ascii="Calibri" w:hAnsi="Calibri"/>
-          <w:b w:val="0"/>
-          <w:i w:val="0"/>
-          <w:color w:val="333333"/>
-          <w:sz w:val="21"/>
-        </w:rPr>
-        <w:t>» que copia el texto al portapapeles (cambia a «Copied ✓»).</w:t>
+        <w:t>Cada respuesta incluye un botón “Copy” que copia el texto al portapapeles (cambia a “Copied ✓”).</w:t>
       </w:r>
     </w:p>
     <w:p>
-      <w:pPr>
-        <w:spacing w:before="200" w:after="60"/>
-      </w:pPr>
       <w:r>
         <w:rPr>
-          <w:rFonts w:ascii="Calibri" w:hAnsi="Calibri"/>
           <w:b/>
-          <w:i w:val="0"/>
-          <w:color w:val="333333"/>
-          <w:sz w:val="25"/>
+          <w:color w:val="2E3440"/>
+          <w:sz w:val="24"/>
         </w:rPr>
         <w:t>6.4 Conversación de seguimiento</w:t>
       </w:r>
     </w:p>
     <w:p>
       <w:pPr>
-        <w:spacing w:after="40"/>
-        <w:ind w:left="340"/>
+        <w:pStyle w:val="ListBullet"/>
       </w:pPr>
       <w:r>
-        <w:rPr>
-          <w:rFonts w:ascii="Calibri" w:hAnsi="Calibri"/>
-          <w:b/>
-          <w:i w:val="0"/>
-          <w:color w:val="009845"/>
-          <w:sz w:val="21"/>
-        </w:rPr>
-        <w:t xml:space="preserve">▪  </w:t>
-      </w:r>
-      <w:r>
-        <w:rPr>
-          <w:rFonts w:ascii="Calibri" w:hAnsi="Calibri"/>
-          <w:b w:val="0"/>
-          <w:i w:val="0"/>
-          <w:color w:val="333333"/>
-          <w:sz w:val="21"/>
-        </w:rPr>
-        <w:t xml:space="preserve">Puede seguir preguntando: la extensión conserva la memoria de la conversación (hasta </w:t>
-      </w:r>
-      <w:r>
-        <w:rPr>
-          <w:rFonts w:ascii="Calibri" w:hAnsi="Calibri"/>
-          <w:b/>
-          <w:i w:val="0"/>
-          <w:color w:val="333333"/>
-          <w:sz w:val="21"/>
-        </w:rPr>
-        <w:t>12 turnos</w:t>
-      </w:r>
-      <w:r>
-        <w:rPr>
-          <w:rFonts w:ascii="Calibri" w:hAnsi="Calibri"/>
-          <w:b w:val="0"/>
-          <w:i w:val="0"/>
-          <w:color w:val="333333"/>
-          <w:sz w:val="21"/>
-        </w:rPr>
-        <w:t>; los más antiguos se descartan).</w:t>
+        <w:t>Puede seguir preguntando: la extensión conserva la memoria de la conversación (hasta 12 turnos; los más antiguos se descartan para optimizar el contexto).</w:t>
       </w:r>
     </w:p>
     <w:p>
       <w:pPr>
-        <w:spacing w:after="40"/>
-        <w:ind w:left="340"/>
+        <w:pStyle w:val="ListBullet"/>
       </w:pPr>
       <w:r>
-        <w:rPr>
-          <w:rFonts w:ascii="Calibri" w:hAnsi="Calibri"/>
-          <w:b/>
-          <w:i w:val="0"/>
-          <w:color w:val="009845"/>
-          <w:sz w:val="21"/>
-        </w:rPr>
-        <w:t xml:space="preserve">▪  </w:t>
-      </w:r>
-      <w:r>
-        <w:rPr>
-          <w:rFonts w:ascii="Calibri" w:hAnsi="Calibri"/>
-          <w:b w:val="0"/>
-          <w:i w:val="0"/>
-          <w:color w:val="333333"/>
-          <w:sz w:val="21"/>
-        </w:rPr>
-        <w:t>«</w:t>
-      </w:r>
-      <w:r>
-        <w:rPr>
-          <w:rFonts w:ascii="Calibri" w:hAnsi="Calibri"/>
-          <w:b/>
-          <w:i w:val="0"/>
-          <w:color w:val="333333"/>
-          <w:sz w:val="21"/>
-        </w:rPr>
-        <w:t>New chat</w:t>
-      </w:r>
-      <w:r>
-        <w:rPr>
-          <w:rFonts w:ascii="Calibri" w:hAnsi="Calibri"/>
-          <w:b w:val="0"/>
-          <w:i w:val="0"/>
-          <w:color w:val="333333"/>
-          <w:sz w:val="21"/>
-        </w:rPr>
-        <w:t>» reinicia la conversación (mantiene los gráficos seleccionados). El contexto de la app se reenvía en la primera pregunta de la nueva conversación.</w:t>
+        <w:t>“New chat” reinicia la conversación (mantiene los gráficos seleccionados). El contexto de la app se reenvía siempre junto con la primera pregunta de la nueva conversación.</w:t>
       </w:r>
     </w:p>
     <w:p>
       <w:pPr>
-        <w:spacing w:before="200" w:after="60"/>
+        <w:pStyle w:val="ListBullet"/>
       </w:pPr>
       <w:r>
+        <w:t>Al cambiar de modelo se le avisa de que se limpiará la conversación en curso.</w:t>
+      </w:r>
+    </w:p>
+    <w:p>
+      <w:r>
         <w:rPr>
-          <w:rFonts w:ascii="Calibri" w:hAnsi="Calibri"/>
           <w:b/>
-          <w:i w:val="0"/>
-          <w:color w:val="333333"/>
-          <w:sz w:val="25"/>
+          <w:color w:val="2E3440"/>
+          <w:sz w:val="24"/>
         </w:rPr>
         <w:t>6.5 Opciones avanzadas</w:t>
       </w:r>
     </w:p>
     <w:p>
-      <w:pPr>
-        <w:spacing w:after="100"/>
-      </w:pPr>
       <w:r>
-        <w:rPr>
-          <w:rFonts w:ascii="Calibri" w:hAnsi="Calibri"/>
-          <w:b w:val="0"/>
-          <w:i w:val="0"/>
-          <w:color w:val="333333"/>
-          <w:sz w:val="21"/>
-        </w:rPr>
-        <w:t>Despliegue «Advanced Options» para ajustar qué datos se envían y el estilo del análisis:</w:t>
+        <w:t>Despliegue “Advanced Options” para ajustar qué datos se envían y el estilo del análisis:</w:t>
       </w:r>
     </w:p>
     <w:p>
       <w:pPr>
-        <w:spacing w:before="140" w:after="40"/>
+        <w:pStyle w:val="ListBullet"/>
       </w:pPr>
       <w:r>
-        <w:rPr>
-          <w:rFonts w:ascii="Calibri" w:hAnsi="Calibri"/>
-          <w:b/>
-          <w:i w:val="0"/>
-          <w:color w:val="595959"/>
-          <w:sz w:val="21"/>
-        </w:rPr>
-        <w:t>Data Settings</w:t>
+        <w:t>Data Settings: “Include app context (data model) on first message” (activado por defecto), “Max data rows” (predeterminado 1000; rango 10–10000), “Include numeric values”, “Simplify data structure”, “Include dimensions”, “Include measures”.</w:t>
       </w:r>
     </w:p>
     <w:p>
       <w:pPr>
-        <w:spacing w:after="40"/>
-        <w:ind w:left="340"/>
+        <w:pStyle w:val="ListBullet"/>
       </w:pPr>
       <w:r>
-        <w:rPr>
-          <w:rFonts w:ascii="Calibri" w:hAnsi="Calibri"/>
-          <w:b/>
-          <w:i w:val="0"/>
-          <w:color w:val="009845"/>
-          <w:sz w:val="21"/>
-        </w:rPr>
-        <w:t xml:space="preserve">▪  </w:t>
-      </w:r>
-      <w:r>
-        <w:rPr>
-          <w:rFonts w:ascii="Calibri" w:hAnsi="Calibri"/>
-          <w:b w:val="0"/>
-          <w:i w:val="0"/>
-          <w:color w:val="333333"/>
-          <w:sz w:val="21"/>
-        </w:rPr>
-        <w:t>«Include app context (data model) on first message» (activado por defecto).</w:t>
+        <w:t>Analysis Style: “Business analyst (default)”, “Technical analyst”, “Executive summary” o “Custom” (con un área de texto para sus propias instrucciones de sistema).</w:t>
       </w:r>
     </w:p>
     <w:p>
       <w:pPr>
-        <w:spacing w:after="40"/>
-        <w:ind w:left="340"/>
+        <w:pStyle w:val="ListBullet"/>
       </w:pPr>
       <w:r>
-        <w:rPr>
-          <w:rFonts w:ascii="Calibri" w:hAnsi="Calibri"/>
-          <w:b/>
-          <w:i w:val="0"/>
-          <w:color w:val="009845"/>
-          <w:sz w:val="21"/>
-        </w:rPr>
-        <w:t xml:space="preserve">▪  </w:t>
-      </w:r>
-      <w:r>
-        <w:rPr>
-          <w:rFonts w:ascii="Calibri" w:hAnsi="Calibri"/>
-          <w:b w:val="0"/>
-          <w:i w:val="0"/>
-          <w:color w:val="333333"/>
-          <w:sz w:val="21"/>
-        </w:rPr>
-        <w:t xml:space="preserve">«Max data rows:» (predeterminado </w:t>
-      </w:r>
-      <w:r>
-        <w:rPr>
-          <w:rFonts w:ascii="Calibri" w:hAnsi="Calibri"/>
-          <w:b/>
-          <w:i w:val="0"/>
-          <w:color w:val="333333"/>
-          <w:sz w:val="21"/>
-        </w:rPr>
-        <w:t>1000</w:t>
-      </w:r>
-      <w:r>
-        <w:rPr>
-          <w:rFonts w:ascii="Calibri" w:hAnsi="Calibri"/>
-          <w:b w:val="0"/>
-          <w:i w:val="0"/>
-          <w:color w:val="333333"/>
-          <w:sz w:val="21"/>
-        </w:rPr>
-        <w:t>; rango 10–10000).</w:t>
+        <w:t>Streaming: renderizado token a token de la respuesta (se desactiva automáticamente si el navegador o el proxy no pueden transmitir).</w:t>
       </w:r>
     </w:p>
     <w:p>
-      <w:pPr>
-        <w:spacing w:after="40"/>
-        <w:ind w:left="340"/>
-      </w:pPr>
       <w:r>
         <w:rPr>
-          <w:rFonts w:ascii="Calibri" w:hAnsi="Calibri"/>
           <w:b/>
-          <w:i w:val="0"/>
-          <w:color w:val="009845"/>
-          <w:sz w:val="21"/>
-        </w:rPr>
-        <w:t xml:space="preserve">▪  </w:t>
-      </w:r>
-      <w:r>
-        <w:rPr>
-          <w:rFonts w:ascii="Calibri" w:hAnsi="Calibri"/>
-          <w:b w:val="0"/>
-          <w:i w:val="0"/>
-          <w:color w:val="333333"/>
-          <w:sz w:val="21"/>
-        </w:rPr>
-        <w:t>«Include numeric values», «Simplify data structure», «Include dimensions», «Include measures» (todos activados por defecto).</w:t>
-      </w:r>
-    </w:p>
-    <w:p>
-      <w:pPr>
-        <w:spacing w:before="140" w:after="40"/>
-      </w:pPr>
-      <w:r>
-        <w:rPr>
-          <w:rFonts w:ascii="Calibri" w:hAnsi="Calibri"/>
-          <w:b/>
-          <w:i w:val="0"/>
-          <w:color w:val="595959"/>
-          <w:sz w:val="21"/>
-        </w:rPr>
-        <w:t>Analysis Style</w:t>
-      </w:r>
-    </w:p>
-    <w:p>
-      <w:pPr>
-        <w:spacing w:after="40"/>
-        <w:ind w:left="340"/>
-      </w:pPr>
-      <w:r>
-        <w:rPr>
-          <w:rFonts w:ascii="Calibri" w:hAnsi="Calibri"/>
-          <w:b/>
-          <w:i w:val="0"/>
-          <w:color w:val="009845"/>
-          <w:sz w:val="21"/>
-        </w:rPr>
-        <w:t xml:space="preserve">▪  </w:t>
-      </w:r>
-      <w:r>
-        <w:rPr>
-          <w:rFonts w:ascii="Calibri" w:hAnsi="Calibri"/>
-          <w:b w:val="0"/>
-          <w:i w:val="0"/>
-          <w:color w:val="333333"/>
-          <w:sz w:val="21"/>
-        </w:rPr>
-        <w:t>«Business analyst (default)», «Technical analyst», «Executive summary» o «Custom».</w:t>
-      </w:r>
-    </w:p>
-    <w:p>
-      <w:pPr>
-        <w:spacing w:after="40"/>
-        <w:ind w:left="340"/>
-      </w:pPr>
-      <w:r>
-        <w:rPr>
-          <w:rFonts w:ascii="Calibri" w:hAnsi="Calibri"/>
-          <w:b/>
-          <w:i w:val="0"/>
-          <w:color w:val="009845"/>
-          <w:sz w:val="21"/>
-        </w:rPr>
-        <w:t xml:space="preserve">▪  </w:t>
-      </w:r>
-      <w:r>
-        <w:rPr>
-          <w:rFonts w:ascii="Calibri" w:hAnsi="Calibri"/>
-          <w:b w:val="0"/>
-          <w:i w:val="0"/>
-          <w:color w:val="333333"/>
-          <w:sz w:val="21"/>
-        </w:rPr>
-        <w:t>Al elegir «Custom» aparece un área de texto («Enter custom system prompt») para escribir sus propias instrucciones de sistema.</w:t>
-      </w:r>
-    </w:p>
-    <w:p>
-      <w:pPr>
-        <w:spacing w:before="200" w:after="60"/>
-      </w:pPr>
-      <w:r>
-        <w:rPr>
-          <w:rFonts w:ascii="Calibri" w:hAnsi="Calibri"/>
-          <w:b/>
-          <w:i w:val="0"/>
-          <w:color w:val="333333"/>
-          <w:sz w:val="25"/>
+          <w:color w:val="2E3440"/>
+          <w:sz w:val="24"/>
         </w:rPr>
         <w:t>6.6 Sugerir un gráfico</w:t>
       </w:r>
     </w:p>
     <w:p>
       <w:pPr>
-        <w:spacing w:after="40"/>
-        <w:ind w:left="340"/>
+        <w:pStyle w:val="ListBullet"/>
       </w:pPr>
       <w:r>
-        <w:rPr>
-          <w:rFonts w:ascii="Calibri" w:hAnsi="Calibri"/>
-          <w:b/>
-          <w:i w:val="0"/>
-          <w:color w:val="009845"/>
-          <w:sz w:val="21"/>
-        </w:rPr>
-        <w:t xml:space="preserve">▪  </w:t>
-      </w:r>
-      <w:r>
-        <w:rPr>
-          <w:rFonts w:ascii="Calibri" w:hAnsi="Calibri"/>
-          <w:b w:val="0"/>
-          <w:i w:val="0"/>
-          <w:color w:val="333333"/>
-          <w:sz w:val="21"/>
-        </w:rPr>
-        <w:t>Tras recibir un análisis, pulse «</w:t>
-      </w:r>
-      <w:r>
-        <w:rPr>
-          <w:rFonts w:ascii="Calibri" w:hAnsi="Calibri"/>
-          <w:b/>
-          <w:i w:val="0"/>
-          <w:color w:val="333333"/>
-          <w:sz w:val="21"/>
-        </w:rPr>
-        <w:t>Suggest a chart</w:t>
-      </w:r>
-      <w:r>
-        <w:rPr>
-          <w:rFonts w:ascii="Calibri" w:hAnsi="Calibri"/>
-          <w:b w:val="0"/>
-          <w:i w:val="0"/>
-          <w:color w:val="333333"/>
-          <w:sz w:val="21"/>
-        </w:rPr>
-        <w:t>» (la IA propone un gráfico de Qlik; el estado muestra «Designing a chart…»).</w:t>
+        <w:t>Tras recibir un análisis, pulse “Suggest a chart” (la IA propone un gráfico de Qlik; el estado muestra “Designing a chart…”).</w:t>
       </w:r>
     </w:p>
     <w:p>
       <w:pPr>
-        <w:spacing w:after="40"/>
-        <w:ind w:left="340"/>
+        <w:pStyle w:val="ListBullet"/>
       </w:pPr>
       <w:r>
-        <w:rPr>
-          <w:rFonts w:ascii="Calibri" w:hAnsi="Calibri"/>
-          <w:b/>
-          <w:i w:val="0"/>
-          <w:color w:val="009845"/>
-          <w:sz w:val="21"/>
-        </w:rPr>
-        <w:t xml:space="preserve">▪  </w:t>
-      </w:r>
-      <w:r>
-        <w:rPr>
-          <w:rFonts w:ascii="Calibri" w:hAnsi="Calibri"/>
-          <w:b w:val="0"/>
-          <w:i w:val="0"/>
-          <w:color w:val="333333"/>
-          <w:sz w:val="21"/>
-        </w:rPr>
-        <w:t xml:space="preserve">Se muestra una </w:t>
-      </w:r>
-      <w:r>
-        <w:rPr>
-          <w:rFonts w:ascii="Calibri" w:hAnsi="Calibri"/>
-          <w:b/>
-          <w:i w:val="0"/>
-          <w:color w:val="333333"/>
-          <w:sz w:val="21"/>
-        </w:rPr>
-        <w:t>vista previa</w:t>
-      </w:r>
-      <w:r>
-        <w:rPr>
-          <w:rFonts w:ascii="Calibri" w:hAnsi="Calibri"/>
-          <w:b w:val="0"/>
-          <w:i w:val="0"/>
-          <w:color w:val="333333"/>
-          <w:sz w:val="21"/>
-        </w:rPr>
-        <w:t xml:space="preserve"> del gráfico propuesto.</w:t>
+        <w:t>Se muestra una vista previa del gráfico propuesto.</w:t>
       </w:r>
     </w:p>
     <w:p>
       <w:pPr>
-        <w:spacing w:after="40"/>
-        <w:ind w:left="340"/>
+        <w:pStyle w:val="ListBullet"/>
       </w:pPr>
       <w:r>
-        <w:rPr>
-          <w:rFonts w:ascii="Calibri" w:hAnsi="Calibri"/>
-          <w:b/>
-          <w:i w:val="0"/>
-          <w:color w:val="009845"/>
-          <w:sz w:val="21"/>
-        </w:rPr>
-        <w:t xml:space="preserve">▪  </w:t>
-      </w:r>
-      <w:r>
-        <w:rPr>
-          <w:rFonts w:ascii="Calibri" w:hAnsi="Calibri"/>
-          <w:b w:val="0"/>
-          <w:i w:val="0"/>
-          <w:color w:val="333333"/>
-          <w:sz w:val="21"/>
-        </w:rPr>
-        <w:t xml:space="preserve">Con la hoja en </w:t>
-      </w:r>
-      <w:r>
-        <w:rPr>
-          <w:rFonts w:ascii="Calibri" w:hAnsi="Calibri"/>
-          <w:b/>
-          <w:i w:val="0"/>
-          <w:color w:val="333333"/>
-          <w:sz w:val="21"/>
-        </w:rPr>
-        <w:t>modo edición</w:t>
-      </w:r>
-      <w:r>
-        <w:rPr>
-          <w:rFonts w:ascii="Calibri" w:hAnsi="Calibri"/>
-          <w:b w:val="0"/>
-          <w:i w:val="0"/>
-          <w:color w:val="333333"/>
-          <w:sz w:val="21"/>
-        </w:rPr>
-        <w:t>, pulse «</w:t>
-      </w:r>
-      <w:r>
-        <w:rPr>
-          <w:rFonts w:ascii="Calibri" w:hAnsi="Calibri"/>
-          <w:b/>
-          <w:i w:val="0"/>
-          <w:color w:val="333333"/>
-          <w:sz w:val="21"/>
-        </w:rPr>
-        <w:t>Add to sheet</w:t>
-      </w:r>
-      <w:r>
-        <w:rPr>
-          <w:rFonts w:ascii="Calibri" w:hAnsi="Calibri"/>
-          <w:b w:val="0"/>
-          <w:i w:val="0"/>
-          <w:color w:val="333333"/>
-          <w:sz w:val="21"/>
-        </w:rPr>
-        <w:t>» para añadirlo («Adding…» → «Added to sheet ✓»). Fuera de edición verá «Open the sheet in Edit mode to add charts.».</w:t>
+        <w:t>Con la hoja en modo edición, pulse “Add to sheet” para añadirlo. Fuera de edición verá “Open the sheet in Edit mode to add charts.”. Si la hoja está llena, se ofrece “Create a new sheet”.</w:t>
       </w:r>
     </w:p>
     <w:p>
       <w:pPr>
-        <w:spacing w:after="40"/>
-        <w:ind w:left="340"/>
+        <w:pStyle w:val="ListBullet"/>
+        <w:ind w:left="1080"/>
       </w:pPr>
       <w:r>
-        <w:rPr>
-          <w:rFonts w:ascii="Calibri" w:hAnsi="Calibri"/>
-          <w:b/>
-          <w:i w:val="0"/>
-          <w:color w:val="009845"/>
-          <w:sz w:val="21"/>
-        </w:rPr>
-        <w:t xml:space="preserve">▪  </w:t>
-      </w:r>
-      <w:r>
-        <w:rPr>
-          <w:rFonts w:ascii="Calibri" w:hAnsi="Calibri"/>
-          <w:b w:val="0"/>
-          <w:i w:val="0"/>
-          <w:color w:val="333333"/>
-          <w:sz w:val="21"/>
-        </w:rPr>
-        <w:t>Si la hoja está llena, se ofrece «</w:t>
-      </w:r>
-      <w:r>
-        <w:rPr>
-          <w:rFonts w:ascii="Calibri" w:hAnsi="Calibri"/>
-          <w:b/>
-          <w:i w:val="0"/>
-          <w:color w:val="333333"/>
-          <w:sz w:val="21"/>
-        </w:rPr>
-        <w:t>Create a new sheet</w:t>
-      </w:r>
-      <w:r>
-        <w:rPr>
-          <w:rFonts w:ascii="Calibri" w:hAnsi="Calibri"/>
-          <w:b w:val="0"/>
-          <w:i w:val="0"/>
-          <w:color w:val="333333"/>
-          <w:sz w:val="21"/>
-        </w:rPr>
-        <w:t>».</w:t>
-      </w:r>
-    </w:p>
-    <w:p>
-      <w:pPr>
-        <w:spacing w:after="40"/>
-        <w:ind w:left="624"/>
-      </w:pPr>
-      <w:r>
-        <w:rPr>
-          <w:rFonts w:ascii="Calibri" w:hAnsi="Calibri"/>
-          <w:b w:val="0"/>
-          <w:i w:val="0"/>
-          <w:color w:val="595959"/>
-          <w:sz w:val="21"/>
-        </w:rPr>
-        <w:t xml:space="preserve">–  </w:t>
-      </w:r>
-      <w:r>
-        <w:rPr>
-          <w:rFonts w:ascii="Calibri" w:hAnsi="Calibri"/>
-          <w:b w:val="0"/>
-          <w:i w:val="0"/>
-          <w:color w:val="595959"/>
-          <w:sz w:val="21"/>
-        </w:rPr>
-        <w:t>Tipos soportados: bar, line, combo, pie, scatter, table, pivot-table, KPI, histogram, distribution, boxplot, waterfall, treemap, gauge, mekko y bullet. Los mapas no están soportados.</w:t>
+        <w:t>Tipos soportados: bar, line, combo, pie, scatter, table, pivot-table, KPI, histogram, distribution, boxplot, waterfall, treemap, gauge, mekko y bullet. Los mapas no están soportados en esta versión.</w:t>
       </w:r>
     </w:p>
     <w:p>
       <w:r>
-        <w:br w:type="page"/>
-      </w:r>
-    </w:p>
-    <w:p>
-      <w:pPr>
-        <w:spacing w:before="280" w:after="120"/>
-        <w:pBdr>
-          <w:bottom w:val="single" w:sz="12" w:space="4" w:color="D7DCD9"/>
-        </w:pBdr>
-      </w:pPr>
-      <w:r>
         <w:rPr>
-          <w:rFonts w:ascii="Calibri" w:hAnsi="Calibri"/>
           <w:b/>
-          <w:i w:val="0"/>
-          <w:color w:val="007A38"/>
-          <w:sz w:val="32"/>
+          <w:color w:val="C15F3C"/>
+          <w:sz w:val="30"/>
         </w:rPr>
         <w:t>7. Mensajes y avisos</w:t>
       </w:r>
@@ -2701,31 +939,25 @@
       <w:tblPr>
         <w:tblStyle w:val="TableGrid"/>
         <w:tblW w:type="auto" w:w="0"/>
-        <w:jc w:val="left"/>
-        <w:tblLayout w:type="fixed"/>
         <w:tblLook w:firstColumn="1" w:firstRow="1" w:lastColumn="0" w:lastRow="0" w:noHBand="0" w:noVBand="1" w:val="04A0"/>
       </w:tblPr>
       <w:tblGrid>
-        <w:gridCol w:w="4986"/>
-        <w:gridCol w:w="4986"/>
+        <w:gridCol w:w="4824"/>
+        <w:gridCol w:w="4824"/>
       </w:tblGrid>
       <w:tr>
         <w:tc>
           <w:tcPr>
-            <w:tcW w:type="dxa" w:w="2835"/>
-            <w:shd w:val="clear" w:color="auto" w:fill="009845"/>
+            <w:tcW w:type="dxa" w:w="4824"/>
+            <w:shd w:val="clear" w:fill="C15F3C"/>
           </w:tcPr>
           <w:p>
-            <w:pPr>
-              <w:spacing w:after="20"/>
-            </w:pPr>
+            <w:r/>
             <w:r>
               <w:rPr>
-                <w:rFonts w:ascii="Calibri" w:hAnsi="Calibri"/>
                 <w:b/>
-                <w:i w:val="0"/>
                 <w:color w:val="FFFFFF"/>
-                <w:sz w:val="19"/>
+                <w:sz w:val="20"/>
               </w:rPr>
               <w:t>Situación</w:t>
             </w:r>
@@ -2733,20 +965,16 @@
         </w:tc>
         <w:tc>
           <w:tcPr>
-            <w:tcW w:type="dxa" w:w="6803"/>
-            <w:shd w:val="clear" w:color="auto" w:fill="009845"/>
+            <w:tcW w:type="dxa" w:w="4824"/>
+            <w:shd w:val="clear" w:fill="C15F3C"/>
           </w:tcPr>
           <w:p>
-            <w:pPr>
-              <w:spacing w:after="20"/>
-            </w:pPr>
+            <w:r/>
             <w:r>
               <w:rPr>
-                <w:rFonts w:ascii="Calibri" w:hAnsi="Calibri"/>
                 <w:b/>
-                <w:i w:val="0"/>
                 <w:color w:val="FFFFFF"/>
-                <w:sz w:val="19"/>
+                <w:sz w:val="20"/>
               </w:rPr>
               <w:t>Mensaje / comportamiento</w:t>
             </w:r>
@@ -2756,41 +984,31 @@
       <w:tr>
         <w:tc>
           <w:tcPr>
-            <w:tcW w:type="dxa" w:w="2835"/>
+            <w:tcW w:type="dxa" w:w="4824"/>
           </w:tcPr>
           <w:p>
-            <w:pPr>
-              <w:spacing w:after="20"/>
-            </w:pPr>
+            <w:r/>
             <w:r>
               <w:rPr>
-                <w:rFonts w:ascii="Calibri" w:hAnsi="Calibri"/>
                 <w:b w:val="0"/>
-                <w:i w:val="0"/>
-                <w:color w:val="333333"/>
-                <w:sz w:val="18"/>
+                <w:sz w:val="19"/>
               </w:rPr>
-              <w:t>Falta la clave de API</w:t>
+              <w:t>Proxy sin configurar</w:t>
             </w:r>
           </w:p>
         </w:tc>
         <w:tc>
           <w:tcPr>
-            <w:tcW w:type="dxa" w:w="6803"/>
+            <w:tcW w:type="dxa" w:w="4824"/>
           </w:tcPr>
           <w:p>
-            <w:pPr>
-              <w:spacing w:after="20"/>
-            </w:pPr>
+            <w:r/>
             <w:r>
               <w:rPr>
-                <w:rFonts w:ascii="Calibri" w:hAnsi="Calibri"/>
                 <w:b w:val="0"/>
-                <w:i w:val="0"/>
-                <w:color w:val="333333"/>
-                <w:sz w:val="18"/>
+                <w:sz w:val="19"/>
               </w:rPr>
-              <w:t>«API key not found. Please enter your Anthropic API key in the settings.»</w:t>
+              <w:t>“Proxy URL is not configured. Set it in Edit object → Settings.” Configure la URL del proxy en las propiedades del objeto.</w:t>
             </w:r>
           </w:p>
         </w:tc>
@@ -2798,20 +1016,14 @@
       <w:tr>
         <w:tc>
           <w:tcPr>
-            <w:tcW w:type="dxa" w:w="2835"/>
-            <w:shd w:val="clear" w:color="auto" w:fill="F7FAF8"/>
+            <w:tcW w:type="dxa" w:w="4824"/>
           </w:tcPr>
           <w:p>
-            <w:pPr>
-              <w:spacing w:after="20"/>
-            </w:pPr>
+            <w:r/>
             <w:r>
               <w:rPr>
-                <w:rFonts w:ascii="Calibri" w:hAnsi="Calibri"/>
                 <w:b w:val="0"/>
-                <w:i w:val="0"/>
-                <w:color w:val="333333"/>
-                <w:sz w:val="18"/>
+                <w:sz w:val="19"/>
               </w:rPr>
               <w:t>Datos grandes (&gt; ~65 KB)</w:t>
             </w:r>
@@ -2819,22 +1031,16 @@
         </w:tc>
         <w:tc>
           <w:tcPr>
-            <w:tcW w:type="dxa" w:w="6803"/>
-            <w:shd w:val="clear" w:color="auto" w:fill="F7FAF8"/>
+            <w:tcW w:type="dxa" w:w="4824"/>
           </w:tcPr>
           <w:p>
-            <w:pPr>
-              <w:spacing w:after="20"/>
-            </w:pPr>
+            <w:r/>
             <w:r>
               <w:rPr>
-                <w:rFonts w:ascii="Calibri" w:hAnsi="Calibri"/>
                 <w:b w:val="0"/>
-                <w:i w:val="0"/>
-                <w:color w:val="333333"/>
-                <w:sz w:val="18"/>
+                <w:sz w:val="19"/>
               </w:rPr>
-              <w:t>Cuadro de confirmación: «The selected chart data is about N KB… Send it anyway?». Puede cancelar y filtrar con selecciones, o continuar.</w:t>
+              <w:t>Cuadro de confirmación: “The selected chart data is about N KB… Send it anyway?”. Puede cancelar y filtrar con selecciones, o continuar.</w:t>
             </w:r>
           </w:p>
         </w:tc>
@@ -2842,19 +1048,14 @@
       <w:tr>
         <w:tc>
           <w:tcPr>
-            <w:tcW w:type="dxa" w:w="2835"/>
+            <w:tcW w:type="dxa" w:w="4824"/>
           </w:tcPr>
           <w:p>
-            <w:pPr>
-              <w:spacing w:after="20"/>
-            </w:pPr>
+            <w:r/>
             <w:r>
               <w:rPr>
-                <w:rFonts w:ascii="Calibri" w:hAnsi="Calibri"/>
                 <w:b w:val="0"/>
-                <w:i w:val="0"/>
-                <w:color w:val="333333"/>
-                <w:sz w:val="18"/>
+                <w:sz w:val="19"/>
               </w:rPr>
               <w:t>Excede la ventana de contexto</w:t>
             </w:r>
@@ -2862,21 +1063,16 @@
         </w:tc>
         <w:tc>
           <w:tcPr>
-            <w:tcW w:type="dxa" w:w="6803"/>
+            <w:tcW w:type="dxa" w:w="4824"/>
           </w:tcPr>
           <w:p>
-            <w:pPr>
-              <w:spacing w:after="20"/>
-            </w:pPr>
+            <w:r/>
             <w:r>
               <w:rPr>
-                <w:rFonts w:ascii="Calibri" w:hAnsi="Calibri"/>
                 <w:b w:val="0"/>
-                <w:i w:val="0"/>
-                <w:color w:val="333333"/>
-                <w:sz w:val="18"/>
+                <w:sz w:val="19"/>
               </w:rPr>
-              <w:t>«This request is about N tokens, which exceeds the … context window…». «OK» trunca los datos del gráfico para que quepan; «Cancel» detiene el envío para que filtre los datos.</w:t>
+              <w:t>“This request is about N tokens, which exceeds the … context window…”. “OK” trunca los datos del gráfico para que quepan; “Cancel” detiene el envío.</w:t>
             </w:r>
           </w:p>
         </w:tc>
@@ -2884,20 +1080,78 @@
       <w:tr>
         <w:tc>
           <w:tcPr>
-            <w:tcW w:type="dxa" w:w="2835"/>
-            <w:shd w:val="clear" w:color="auto" w:fill="F7FAF8"/>
+            <w:tcW w:type="dxa" w:w="4824"/>
           </w:tcPr>
           <w:p>
-            <w:pPr>
-              <w:spacing w:after="20"/>
-            </w:pPr>
+            <w:r/>
             <w:r>
               <w:rPr>
-                <w:rFonts w:ascii="Calibri" w:hAnsi="Calibri"/>
                 <w:b w:val="0"/>
-                <w:i w:val="0"/>
-                <w:color w:val="333333"/>
-                <w:sz w:val="18"/>
+                <w:sz w:val="19"/>
+              </w:rPr>
+              <w:t>Payload demasiado grande (&gt; 1 MB)</w:t>
+            </w:r>
+          </w:p>
+        </w:tc>
+        <w:tc>
+          <w:tcPr>
+            <w:tcW w:type="dxa" w:w="4824"/>
+          </w:tcPr>
+          <w:p>
+            <w:r/>
+            <w:r>
+              <w:rPr>
+                <w:b w:val="0"/>
+                <w:sz w:val="19"/>
+              </w:rPr>
+              <w:t>Bloqueo por el lado del cliente antes de enviar, para evitar un rechazo 413 del proxy con un mensaje menos claro.</w:t>
+            </w:r>
+          </w:p>
+        </w:tc>
+      </w:tr>
+      <w:tr>
+        <w:tc>
+          <w:tcPr>
+            <w:tcW w:type="dxa" w:w="4824"/>
+          </w:tcPr>
+          <w:p>
+            <w:r/>
+            <w:r>
+              <w:rPr>
+                <w:b w:val="0"/>
+                <w:sz w:val="19"/>
+              </w:rPr>
+              <w:t>Proxy ocupado (503)</w:t>
+            </w:r>
+          </w:p>
+        </w:tc>
+        <w:tc>
+          <w:tcPr>
+            <w:tcW w:type="dxa" w:w="4824"/>
+          </w:tcPr>
+          <w:p>
+            <w:r/>
+            <w:r>
+              <w:rPr>
+                <w:b w:val="0"/>
+                <w:sz w:val="19"/>
+              </w:rPr>
+              <w:t>Mensaje amable de “el servicio está ocupado, vuelva a intentarlo”. El proxy aplica control de admisión y cola con límite.</w:t>
+            </w:r>
+          </w:p>
+        </w:tc>
+      </w:tr>
+      <w:tr>
+        <w:tc>
+          <w:tcPr>
+            <w:tcW w:type="dxa" w:w="4824"/>
+          </w:tcPr>
+          <w:p>
+            <w:r/>
+            <w:r>
+              <w:rPr>
+                <w:b w:val="0"/>
+                <w:sz w:val="19"/>
               </w:rPr>
               <w:t>Añadir gráfico sin modo edición</w:t>
             </w:r>
@@ -2905,22 +1159,16 @@
         </w:tc>
         <w:tc>
           <w:tcPr>
-            <w:tcW w:type="dxa" w:w="6803"/>
-            <w:shd w:val="clear" w:color="auto" w:fill="F7FAF8"/>
+            <w:tcW w:type="dxa" w:w="4824"/>
           </w:tcPr>
           <w:p>
-            <w:pPr>
-              <w:spacing w:after="20"/>
-            </w:pPr>
+            <w:r/>
             <w:r>
               <w:rPr>
-                <w:rFonts w:ascii="Calibri" w:hAnsi="Calibri"/>
                 <w:b w:val="0"/>
-                <w:i w:val="0"/>
-                <w:color w:val="333333"/>
-                <w:sz w:val="18"/>
+                <w:sz w:val="19"/>
               </w:rPr>
-              <w:t>«Open the sheet in Edit mode to add charts.»</w:t>
+              <w:t>“Open the sheet in Edit mode to add charts.”</w:t>
             </w:r>
           </w:p>
         </w:tc>
@@ -2928,490 +1176,95 @@
       <w:tr>
         <w:tc>
           <w:tcPr>
-            <w:tcW w:type="dxa" w:w="2835"/>
+            <w:tcW w:type="dxa" w:w="4824"/>
           </w:tcPr>
           <w:p>
-            <w:pPr>
-              <w:spacing w:after="20"/>
-            </w:pPr>
+            <w:r/>
             <w:r>
               <w:rPr>
-                <w:rFonts w:ascii="Calibri" w:hAnsi="Calibri"/>
                 <w:b w:val="0"/>
-                <w:i w:val="0"/>
-                <w:color w:val="333333"/>
-                <w:sz w:val="18"/>
+                <w:sz w:val="19"/>
               </w:rPr>
-              <w:t>Hoja llena</w:t>
+              <w:t>Error de red / sesión (401)</w:t>
             </w:r>
           </w:p>
         </w:tc>
         <w:tc>
           <w:tcPr>
-            <w:tcW w:type="dxa" w:w="6803"/>
+            <w:tcW w:type="dxa" w:w="4824"/>
           </w:tcPr>
           <w:p>
-            <w:pPr>
-              <w:spacing w:after="20"/>
-            </w:pPr>
+            <w:r/>
             <w:r>
               <w:rPr>
-                <w:rFonts w:ascii="Calibri" w:hAnsi="Calibri"/>
                 <w:b w:val="0"/>
-                <w:i w:val="0"/>
-                <w:color w:val="333333"/>
-                <w:sz w:val="18"/>
+                <w:sz w:val="19"/>
               </w:rPr>
-              <w:t>«Sheet is full — …» con la opción «Create a new sheet».</w:t>
-            </w:r>
-          </w:p>
-        </w:tc>
-      </w:tr>
-      <w:tr>
-        <w:tc>
-          <w:tcPr>
-            <w:tcW w:type="dxa" w:w="2835"/>
-            <w:shd w:val="clear" w:color="auto" w:fill="F7FAF8"/>
-          </w:tcPr>
-          <w:p>
-            <w:pPr>
-              <w:spacing w:after="20"/>
-            </w:pPr>
-            <w:r>
-              <w:rPr>
-                <w:rFonts w:ascii="Calibri" w:hAnsi="Calibri"/>
-                <w:b w:val="0"/>
-                <w:i w:val="0"/>
-                <w:color w:val="333333"/>
-                <w:sz w:val="18"/>
-              </w:rPr>
-              <w:t>Error de red / proxy</w:t>
-            </w:r>
-          </w:p>
-        </w:tc>
-        <w:tc>
-          <w:tcPr>
-            <w:tcW w:type="dxa" w:w="6803"/>
-            <w:shd w:val="clear" w:color="auto" w:fill="F7FAF8"/>
-          </w:tcPr>
-          <w:p>
-            <w:pPr>
-              <w:spacing w:after="20"/>
-            </w:pPr>
-            <w:r>
-              <w:rPr>
-                <w:rFonts w:ascii="Calibri" w:hAnsi="Calibri"/>
-                <w:b w:val="0"/>
-                <w:i w:val="0"/>
-                <w:color w:val="333333"/>
-                <w:sz w:val="18"/>
-              </w:rPr>
-              <w:t>Mensaje de error con el detalle. Tiempo de espera de 60 s. Un 401/403 indica clave inválida o sin acceso al modelo elegido.</w:t>
+              <w:t>Mensaje de error con el detalle. Un 401 indica que su sesión de Qlik no es válida o no está autenticada por el proxy. Tiempo de espera de 60 s (hosted) o 5 min (modelo local).</w:t>
             </w:r>
           </w:p>
         </w:tc>
       </w:tr>
     </w:tbl>
+    <w:p/>
     <w:p>
-      <w:pPr>
-        <w:spacing w:before="280" w:after="120"/>
-        <w:pBdr>
-          <w:bottom w:val="single" w:sz="12" w:space="4" w:color="D7DCD9"/>
-        </w:pBdr>
-      </w:pPr>
       <w:r>
         <w:rPr>
-          <w:rFonts w:ascii="Calibri" w:hAnsi="Calibri"/>
           <w:b/>
-          <w:i w:val="0"/>
-          <w:color w:val="007A38"/>
-          <w:sz w:val="32"/>
+          <w:color w:val="C15F3C"/>
+          <w:sz w:val="30"/>
         </w:rPr>
         <w:t>8. Buenas prácticas y privacidad</w:t>
       </w:r>
     </w:p>
     <w:p>
       <w:pPr>
-        <w:spacing w:after="40"/>
-        <w:ind w:left="340"/>
+        <w:pStyle w:val="ListBullet"/>
       </w:pPr>
       <w:r>
-        <w:rPr>
-          <w:rFonts w:ascii="Calibri" w:hAnsi="Calibri"/>
-          <w:b/>
-          <w:i w:val="0"/>
-          <w:color w:val="009845"/>
-          <w:sz w:val="21"/>
-        </w:rPr>
-        <w:t xml:space="preserve">▪  </w:t>
-      </w:r>
-      <w:r>
-        <w:rPr>
-          <w:rFonts w:ascii="Calibri" w:hAnsi="Calibri"/>
-          <w:b/>
-          <w:i w:val="0"/>
-          <w:color w:val="333333"/>
-          <w:sz w:val="21"/>
-        </w:rPr>
-        <w:t>Filtre los datos con selecciones</w:t>
-      </w:r>
-      <w:r>
-        <w:rPr>
-          <w:rFonts w:ascii="Calibri" w:hAnsi="Calibri"/>
-          <w:b w:val="0"/>
-          <w:i w:val="0"/>
-          <w:color w:val="333333"/>
-          <w:sz w:val="21"/>
-        </w:rPr>
-        <w:t xml:space="preserve"> antes de enviar: reduce tokens, coste y latencia, y evita superar la ventana de contexto del modelo.</w:t>
+        <w:t>Filtre los datos con selecciones antes de enviar: reduce tokens, coste y latencia, y evita superar la ventana de contexto del modelo.</w:t>
       </w:r>
     </w:p>
     <w:p>
       <w:pPr>
-        <w:spacing w:after="40"/>
-        <w:ind w:left="340"/>
+        <w:pStyle w:val="ListBullet"/>
       </w:pPr>
       <w:r>
-        <w:rPr>
-          <w:rFonts w:ascii="Calibri" w:hAnsi="Calibri"/>
-          <w:b/>
-          <w:i w:val="0"/>
-          <w:color w:val="009845"/>
-          <w:sz w:val="21"/>
-        </w:rPr>
-        <w:t xml:space="preserve">▪  </w:t>
-      </w:r>
-      <w:r>
-        <w:rPr>
-          <w:rFonts w:ascii="Calibri" w:hAnsi="Calibri"/>
-          <w:b w:val="0"/>
-          <w:i w:val="0"/>
-          <w:color w:val="333333"/>
-          <w:sz w:val="21"/>
-        </w:rPr>
-        <w:t xml:space="preserve">Recuerde que </w:t>
-      </w:r>
-      <w:r>
-        <w:rPr>
-          <w:rFonts w:ascii="Calibri" w:hAnsi="Calibri"/>
-          <w:b/>
-          <w:i w:val="0"/>
-          <w:color w:val="333333"/>
-          <w:sz w:val="21"/>
-        </w:rPr>
-        <w:t>los datos del gráfico salen del entorno</w:t>
-      </w:r>
-      <w:r>
-        <w:rPr>
-          <w:rFonts w:ascii="Calibri" w:hAnsi="Calibri"/>
-          <w:b w:val="0"/>
-          <w:i w:val="0"/>
-          <w:color w:val="333333"/>
-          <w:sz w:val="21"/>
-        </w:rPr>
-        <w:t xml:space="preserve"> hacia un LLM externo (Anthropic), junto con nombres reales de tablas/campos y expresiones de ítems maestros en la primera pregunta.</w:t>
+        <w:t>Recuerde que, con modelos hospedados, los datos del gráfico salen del entorno hacia un LLM externo (Anthropic) a través del proxy, junto con nombres reales de tablas/campos y expresiones de ítems maestros en la primera pregunta.</w:t>
       </w:r>
     </w:p>
     <w:p>
       <w:pPr>
-        <w:spacing w:after="40"/>
-        <w:ind w:left="340"/>
+        <w:pStyle w:val="ListBullet"/>
       </w:pPr>
       <w:r>
-        <w:rPr>
-          <w:rFonts w:ascii="Calibri" w:hAnsi="Calibri"/>
-          <w:b/>
-          <w:i w:val="0"/>
-          <w:color w:val="009845"/>
-          <w:sz w:val="21"/>
-        </w:rPr>
-        <w:t xml:space="preserve">▪  </w:t>
-      </w:r>
-      <w:r>
-        <w:rPr>
-          <w:rFonts w:ascii="Calibri" w:hAnsi="Calibri"/>
-          <w:b/>
-          <w:i w:val="0"/>
-          <w:color w:val="333333"/>
-          <w:sz w:val="21"/>
-        </w:rPr>
-        <w:t>No utilice la extensión con datos sensibles, regulados o personales</w:t>
-      </w:r>
-      <w:r>
-        <w:rPr>
-          <w:rFonts w:ascii="Calibri" w:hAnsi="Calibri"/>
-          <w:b w:val="0"/>
-          <w:i w:val="0"/>
-          <w:color w:val="333333"/>
-          <w:sz w:val="21"/>
-        </w:rPr>
-        <w:t xml:space="preserve"> salvo que el egreso de esos datos esté expresamente permitido en su organización.</w:t>
+        <w:t>Con un modelo local (Ollama) los datos permanecen en su infraestructura: útil para datos que no deben salir del perímetro.</w:t>
       </w:r>
     </w:p>
     <w:p>
       <w:pPr>
-        <w:spacing w:after="40"/>
-        <w:ind w:left="340"/>
+        <w:pStyle w:val="ListBullet"/>
       </w:pPr>
       <w:r>
-        <w:rPr>
-          <w:rFonts w:ascii="Calibri" w:hAnsi="Calibri"/>
-          <w:b/>
-          <w:i w:val="0"/>
-          <w:color w:val="009845"/>
-          <w:sz w:val="21"/>
-        </w:rPr>
-        <w:t xml:space="preserve">▪  </w:t>
-      </w:r>
-      <w:r>
-        <w:rPr>
-          <w:rFonts w:ascii="Calibri" w:hAnsi="Calibri"/>
-          <w:b w:val="0"/>
-          <w:i w:val="0"/>
-          <w:color w:val="333333"/>
-          <w:sz w:val="21"/>
-        </w:rPr>
-        <w:t xml:space="preserve">La clave de API se guarda </w:t>
-      </w:r>
-      <w:r>
-        <w:rPr>
-          <w:rFonts w:ascii="Calibri" w:hAnsi="Calibri"/>
-          <w:b/>
-          <w:i w:val="0"/>
-          <w:color w:val="333333"/>
-          <w:sz w:val="21"/>
-        </w:rPr>
-        <w:t>ofuscada</w:t>
-      </w:r>
-      <w:r>
-        <w:rPr>
-          <w:rFonts w:ascii="Calibri" w:hAnsi="Calibri"/>
-          <w:b w:val="0"/>
-          <w:i w:val="0"/>
-          <w:color w:val="333333"/>
-          <w:sz w:val="21"/>
-        </w:rPr>
-        <w:t xml:space="preserve"> en el navegador, no cifrada de forma robusta (adecuado solo para demos internas).</w:t>
+        <w:t>La clave de API ya no está en el navegador: vive solo en el proxy (variable de entorno del servidor). El proxy autentica a quien llama mediante su sesión de Qlik.</w:t>
       </w:r>
     </w:p>
     <w:p>
       <w:pPr>
-        <w:spacing w:before="280" w:after="120"/>
-        <w:pBdr>
-          <w:bottom w:val="single" w:sz="12" w:space="4" w:color="D7DCD9"/>
-        </w:pBdr>
+        <w:pStyle w:val="ListBullet"/>
       </w:pPr>
       <w:r>
-        <w:rPr>
-          <w:rFonts w:ascii="Calibri" w:hAnsi="Calibri"/>
-          <w:b/>
-          <w:i w:val="0"/>
-          <w:color w:val="007A38"/>
-          <w:sz w:val="32"/>
-        </w:rPr>
-        <w:t>9. Aviso importante</w:t>
+        <w:t>Atienda al uso de la extensión con datos sensibles, regulados o personales salvo que la salida de esos datos esté expresamente permitida en su organización.</w:t>
       </w:r>
     </w:p>
-    <w:tbl>
-      <w:tblPr>
-        <w:tblStyle w:val="TableGrid"/>
-        <w:tblW w:type="auto" w:w="0"/>
-        <w:tblLook w:firstColumn="1" w:firstRow="1" w:lastColumn="0" w:lastRow="0" w:noHBand="0" w:noVBand="1" w:val="04A0"/>
-      </w:tblPr>
-      <w:tblGrid>
-        <w:gridCol w:w="9972"/>
-      </w:tblGrid>
-      <w:tr>
-        <w:tc>
-          <w:tcPr>
-            <w:tcW w:type="dxa" w:w="9972"/>
-            <w:shd w:val="clear" w:color="auto" w:fill="FFF8E6"/>
-            <w:tcBorders>
-              <w:top w:val="single" w:sz="6" w:space="4" w:color="E0A800"/>
-              <w:bottom w:val="single" w:sz="6" w:space="4" w:color="E0A800"/>
-              <w:left w:val="single" w:sz="6" w:space="4" w:color="E0A800"/>
-              <w:right w:val="single" w:sz="6" w:space="4" w:color="E0A800"/>
-            </w:tcBorders>
-            <w:tcBorders>
-              <w:left w:val="single" w:sz="24" w:space="4" w:color="E0A800"/>
-            </w:tcBorders>
-          </w:tcPr>
-          <w:p>
-            <w:pPr>
-              <w:spacing w:after="80"/>
-            </w:pPr>
-            <w:r>
-              <w:rPr>
-                <w:rFonts w:ascii="Calibri" w:hAnsi="Calibri"/>
-                <w:b/>
-                <w:i w:val="0"/>
-                <w:color w:val="7A5C00"/>
-                <w:sz w:val="20"/>
-              </w:rPr>
-              <w:t>Aviso — demostración experimental</w:t>
-            </w:r>
-          </w:p>
-          <w:p>
-            <w:pPr>
-              <w:spacing w:after="60"/>
-            </w:pPr>
-            <w:r>
-              <w:rPr>
-                <w:rFonts w:ascii="Calibri" w:hAnsi="Calibri"/>
-                <w:b w:val="0"/>
-                <w:i w:val="0"/>
-                <w:color w:val="333333"/>
-              </w:rPr>
-              <w:t xml:space="preserve">Esta extensión es un activo de </w:t>
-            </w:r>
-            <w:r>
-              <w:rPr>
-                <w:rFonts w:ascii="Calibri" w:hAnsi="Calibri"/>
-                <w:b/>
-                <w:i w:val="0"/>
-                <w:color w:val="333333"/>
-              </w:rPr>
-              <w:t>demostración experimental (v0.3.3, compilación 24)</w:t>
-            </w:r>
-            <w:r>
-              <w:rPr>
-                <w:rFonts w:ascii="Calibri" w:hAnsi="Calibri"/>
-                <w:b w:val="0"/>
-                <w:i w:val="0"/>
-                <w:color w:val="333333"/>
-              </w:rPr>
-              <w:t xml:space="preserve">, no un producto. </w:t>
-            </w:r>
-            <w:r>
-              <w:rPr>
-                <w:rFonts w:ascii="Calibri" w:hAnsi="Calibri"/>
-                <w:b/>
-                <w:i w:val="0"/>
-                <w:color w:val="333333"/>
-              </w:rPr>
-              <w:t>No</w:t>
-            </w:r>
-            <w:r>
-              <w:rPr>
-                <w:rFonts w:ascii="Calibri" w:hAnsi="Calibri"/>
-                <w:b w:val="0"/>
-                <w:i w:val="0"/>
-                <w:color w:val="333333"/>
-              </w:rPr>
-              <w:t xml:space="preserve"> está reforzada para producción y </w:t>
-            </w:r>
-            <w:r>
-              <w:rPr>
-                <w:rFonts w:ascii="Calibri" w:hAnsi="Calibri"/>
-                <w:b/>
-                <w:i w:val="0"/>
-                <w:color w:val="333333"/>
-              </w:rPr>
-              <w:t>no</w:t>
-            </w:r>
-            <w:r>
-              <w:rPr>
-                <w:rFonts w:ascii="Calibri" w:hAnsi="Calibri"/>
-                <w:b w:val="0"/>
-                <w:i w:val="0"/>
-                <w:color w:val="333333"/>
-              </w:rPr>
-              <w:t xml:space="preserve"> es una oferta de Qlik ni una integración soportada.</w:t>
-            </w:r>
-          </w:p>
-          <w:p>
-            <w:pPr>
-              <w:spacing w:after="60"/>
-            </w:pPr>
-            <w:r>
-              <w:rPr>
-                <w:rFonts w:ascii="Calibri" w:hAnsi="Calibri"/>
-                <w:b/>
-                <w:i w:val="0"/>
-                <w:color w:val="333333"/>
-              </w:rPr>
-              <w:t>Ni Qlik ni el autor asumen responsabilidad alguna</w:t>
-            </w:r>
-            <w:r>
-              <w:rPr>
-                <w:rFonts w:ascii="Calibri" w:hAnsi="Calibri"/>
-                <w:b w:val="0"/>
-                <w:i w:val="0"/>
-                <w:color w:val="333333"/>
-              </w:rPr>
-              <w:t xml:space="preserve"> por cualquier incidencia, exposición de datos, coste o daño derivado de su uso en cualquier entorno de cliente o producción. Úselo bajo su propia responsabilidad.</w:t>
-            </w:r>
-          </w:p>
-          <w:p>
-            <w:pPr>
-              <w:spacing w:after="60"/>
-            </w:pPr>
-            <w:r>
-              <w:rPr>
-                <w:rFonts w:ascii="Calibri" w:hAnsi="Calibri"/>
-                <w:b w:val="0"/>
-                <w:i w:val="0"/>
-                <w:color w:val="333333"/>
-              </w:rPr>
-              <w:t>Al hacer una pregunta, los datos del gráfico seleccionado salen del entorno hacia un LLM externo (Anthropic). No lo utilice con datos sensibles, regulados o personales sin autorización expresa.</w:t>
-            </w:r>
-          </w:p>
-        </w:tc>
-      </w:tr>
-    </w:tbl>
     <w:sectPr>
-      <w:footerReference w:type="default" r:id="rId9"/>
       <w:pgSz w:w="12240" w:h="15840"/>
-      <w:pgMar w:top="1134" w:right="1134" w:bottom="1134" w:left="1134" w:header="720" w:footer="720" w:gutter="0"/>
+      <w:pgMar w:top="1152" w:right="1296" w:bottom="1152" w:left="1296" w:header="720" w:footer="720" w:gutter="0"/>
       <w:cols w:space="720"/>
       <w:docGrid w:linePitch="360"/>
     </w:sectPr>
   </w:body>
 </w:document>
-</file>
-
-<file path=word/footer1.xml><?xml version="1.0" encoding="utf-8"?>
-<w:ftr xmlns:m="http://schemas.openxmlformats.org/officeDocument/2006/math" xmlns:mc="http://schemas.openxmlformats.org/markup-compatibility/2006" xmlns:mo="http://schemas.microsoft.com/office/mac/office/2008/main" xmlns:mv="urn:schemas-microsoft-com:mac:vml" xmlns:o="urn:schemas-microsoft-com:office:office" xmlns:r="http://schemas.openxmlformats.org/officeDocument/2006/relationships" xmlns:v="urn:schemas-microsoft-com:vml" xmlns:w10="urn:schemas-microsoft-com:office:word" xmlns:w14="http://schemas.microsoft.com/office/word/2010/wordml" xmlns:w="http://schemas.openxmlformats.org/wordprocessingml/2006/main" xmlns:wne="http://schemas.microsoft.com/office/word/2006/wordml" xmlns:wp14="http://schemas.microsoft.com/office/word/2010/wordprocessingDrawing" xmlns:wp="http://schemas.openxmlformats.org/drawingml/2006/wordprocessingDrawing" xmlns:wpc="http://schemas.microsoft.com/office/word/2010/wordprocessingCanvas" xmlns:wpg="http://schemas.microsoft.com/office/word/2010/wordprocessingGroup" xmlns:wpi="http://schemas.microsoft.com/office/word/2010/wordprocessingInk" xmlns:wps="http://schemas.microsoft.com/office/word/2010/wordprocessingShape" mc:Ignorable="w14 wp14">
-  <w:p>
-    <w:pPr>
-      <w:pStyle w:val="Footer"/>
-      <w:jc w:val="left"/>
-      <w:pBdr>
-        <w:top w:val="single" w:sz="6" w:space="4" w:color="D7DCD9"/>
-      </w:pBdr>
-    </w:pPr>
-    <w:r>
-      <w:rPr>
-        <w:rFonts w:ascii="Calibri" w:hAnsi="Calibri"/>
-        <w:b w:val="0"/>
-        <w:i w:val="0"/>
-        <w:color w:val="595959"/>
-        <w:sz w:val="16"/>
-      </w:rPr>
-      <w:t xml:space="preserve">Anthropic AI Assistant para Qlik Sense · v0.3.3 · Demostración experimental — sin garantía      </w:t>
-    </w:r>
-    <w:r>
-      <w:rPr>
-        <w:rFonts w:ascii="Calibri" w:hAnsi="Calibri"/>
-        <w:b w:val="0"/>
-        <w:i w:val="0"/>
-        <w:color w:val="595959"/>
-        <w:sz w:val="16"/>
-      </w:rPr>
-      <w:t xml:space="preserve">Página </w:t>
-    </w:r>
-    <w:r>
-      <w:rPr>
-        <w:rFonts w:ascii="Calibri" w:hAnsi="Calibri"/>
-        <w:color w:val="595959"/>
-        <w:sz w:val="16"/>
-      </w:rPr>
-      <w:fldChar w:fldCharType="begin"/>
-      <w:instrText xml:space="preserve">PAGE</w:instrText>
-      <w:fldChar w:fldCharType="end"/>
-    </w:r>
-  </w:p>
-</w:ftr>
 </file>
 
 <file path=word/numbering.xml><?xml version="1.0" encoding="utf-8"?>
@@ -3779,7 +1632,6 @@
     <w:rsid w:val="00FC693F"/>
     <w:rPr>
       <w:rFonts w:ascii="Calibri" w:hAnsi="Calibri"/>
-      <w:color w:val="333333"/>
       <w:sz w:val="21"/>
     </w:rPr>
   </w:style>

</xml_diff>